<commit_message>
Finalización de la Estapa 1, carga de datos masivos y capturas de pantalla
</commit_message>
<xml_diff>
--- a/Creación de la base de datos Biblioteca.docx
+++ b/Creación de la base de datos Biblioteca.docx
@@ -4,14 +4,370 @@
   <w:body>
     <w:p>
       <w:pPr>
-        <w:rPr>
-          <w:b/>
-          <w:lang w:val="es-ES"/>
-        </w:rPr>
-      </w:pPr>
-      <w:r>
-        <w:rPr>
-          <w:b/>
+        <w:jc w:val="center"/>
+        <w:rPr>
+          <w:b/>
+          <w:sz w:val="40"/>
+          <w:szCs w:val="40"/>
+          <w:lang w:val="es-ES"/>
+        </w:rPr>
+      </w:pPr>
+      <w:r>
+        <w:rPr>
+          <w:b/>
+          <w:sz w:val="40"/>
+          <w:szCs w:val="40"/>
+          <w:lang w:val="es-ES"/>
+        </w:rPr>
+        <w:t>Trabajo Integrador Bas de Datos</w:t>
+      </w:r>
+    </w:p>
+    <w:p>
+      <w:pPr>
+        <w:rPr>
+          <w:b/>
+          <w:lang w:val="es-ES"/>
+        </w:rPr>
+      </w:pPr>
+      <w:r>
+        <w:rPr>
+          <w:b/>
+          <w:lang w:val="es-ES"/>
+        </w:rPr>
+        <w:t xml:space="preserve">Integrantes: </w:t>
+      </w:r>
+      <w:proofErr w:type="gramStart"/>
+      <w:r>
+        <w:rPr>
+          <w:b/>
+          <w:lang w:val="es-ES"/>
+        </w:rPr>
+        <w:t>Sandra ,</w:t>
+      </w:r>
+      <w:proofErr w:type="gramEnd"/>
+      <w:r>
+        <w:rPr>
+          <w:b/>
+          <w:lang w:val="es-ES"/>
+        </w:rPr>
+        <w:t xml:space="preserve"> Fabricio, Julián, Melisa </w:t>
+      </w:r>
+      <w:proofErr w:type="spellStart"/>
+      <w:r>
+        <w:rPr>
+          <w:b/>
+          <w:lang w:val="es-ES"/>
+        </w:rPr>
+        <w:t>Martellini</w:t>
+      </w:r>
+      <w:proofErr w:type="spellEnd"/>
+    </w:p>
+    <w:p>
+      <w:pPr>
+        <w:rPr>
+          <w:lang w:val="es-ES"/>
+        </w:rPr>
+      </w:pPr>
+    </w:p>
+    <w:p>
+      <w:pPr>
+        <w:rPr>
+          <w:b/>
+          <w:sz w:val="24"/>
+          <w:szCs w:val="24"/>
+          <w:lang w:val="es-ES"/>
+        </w:rPr>
+      </w:pPr>
+      <w:r>
+        <w:rPr>
+          <w:lang w:val="es-ES"/>
+        </w:rPr>
+        <w:t xml:space="preserve">El presente trabajo tiene como objetivo el diseño, implementación y carga masiva de una base de datos relacional denominada </w:t>
+      </w:r>
+      <w:r>
+        <w:rPr>
+          <w:rStyle w:val="Textoennegrita"/>
+          <w:lang w:val="es-ES"/>
+        </w:rPr>
+        <w:t>Biblioteca</w:t>
+      </w:r>
+      <w:r>
+        <w:rPr>
+          <w:lang w:val="es-ES"/>
+        </w:rPr>
+        <w:t xml:space="preserve">, orientada a gestionar el registro técnico y físico de ejemplares bibliográficos. El desarrollo se divide </w:t>
+      </w:r>
+      <w:r>
+        <w:rPr>
+          <w:lang w:val="es-ES"/>
+        </w:rPr>
+        <w:t>en diferentes etapas</w:t>
+      </w:r>
+    </w:p>
+    <w:p>
+      <w:pPr>
+        <w:rPr>
+          <w:b/>
+          <w:lang w:val="es-ES"/>
+        </w:rPr>
+      </w:pPr>
+      <w:r>
+        <w:rPr>
+          <w:b/>
+          <w:sz w:val="24"/>
+          <w:szCs w:val="24"/>
+          <w:lang w:val="es-ES"/>
+        </w:rPr>
+        <w:t xml:space="preserve">Etapa 1- </w:t>
+      </w:r>
+      <w:r>
+        <w:rPr>
+          <w:b/>
+          <w:lang w:val="es-ES"/>
+        </w:rPr>
+        <w:t>Diseño del modelo y creación de tablas</w:t>
+      </w:r>
+    </w:p>
+    <w:p>
+      <w:pPr>
+        <w:rPr>
+          <w:rFonts w:cstheme="minorHAnsi"/>
+          <w:lang w:val="es-ES"/>
+        </w:rPr>
+      </w:pPr>
+      <w:r>
+        <w:rPr>
+          <w:rFonts w:cstheme="minorHAnsi"/>
+          <w:lang w:val="es-ES"/>
+        </w:rPr>
+        <w:t xml:space="preserve">Se elaboró un </w:t>
+      </w:r>
+      <w:r>
+        <w:rPr>
+          <w:rStyle w:val="Textoennegrita"/>
+          <w:rFonts w:cstheme="minorHAnsi"/>
+          <w:b w:val="0"/>
+          <w:lang w:val="es-ES"/>
+        </w:rPr>
+        <w:t>modelo Entidad-Relación (DER)</w:t>
+      </w:r>
+      <w:r>
+        <w:rPr>
+          <w:rFonts w:cstheme="minorHAnsi"/>
+          <w:lang w:val="es-ES"/>
+        </w:rPr>
+        <w:t xml:space="preserve"> que representa las entidades fundamentales del sistema: </w:t>
+      </w:r>
+      <w:proofErr w:type="spellStart"/>
+      <w:r>
+        <w:rPr>
+          <w:rStyle w:val="CdigoHTML"/>
+          <w:rFonts w:asciiTheme="minorHAnsi" w:eastAsiaTheme="minorHAnsi" w:hAnsiTheme="minorHAnsi" w:cstheme="minorHAnsi"/>
+          <w:b/>
+          <w:sz w:val="22"/>
+          <w:szCs w:val="22"/>
+          <w:lang w:val="es-ES"/>
+        </w:rPr>
+        <w:t>FichaBibliografica</w:t>
+      </w:r>
+      <w:proofErr w:type="spellEnd"/>
+      <w:r>
+        <w:rPr>
+          <w:rFonts w:cstheme="minorHAnsi"/>
+          <w:b/>
+          <w:lang w:val="es-ES"/>
+        </w:rPr>
+        <w:t xml:space="preserve">, </w:t>
+      </w:r>
+      <w:r>
+        <w:rPr>
+          <w:rStyle w:val="CdigoHTML"/>
+          <w:rFonts w:asciiTheme="minorHAnsi" w:eastAsiaTheme="minorHAnsi" w:hAnsiTheme="minorHAnsi" w:cstheme="minorHAnsi"/>
+          <w:b/>
+          <w:sz w:val="22"/>
+          <w:szCs w:val="22"/>
+          <w:lang w:val="es-ES"/>
+        </w:rPr>
+        <w:t>Libro</w:t>
+      </w:r>
+      <w:r>
+        <w:rPr>
+          <w:rFonts w:cstheme="minorHAnsi"/>
+          <w:b/>
+          <w:lang w:val="es-ES"/>
+        </w:rPr>
+        <w:t xml:space="preserve"> e </w:t>
+      </w:r>
+      <w:r>
+        <w:rPr>
+          <w:rStyle w:val="CdigoHTML"/>
+          <w:rFonts w:asciiTheme="minorHAnsi" w:eastAsiaTheme="minorHAnsi" w:hAnsiTheme="minorHAnsi" w:cstheme="minorHAnsi"/>
+          <w:b/>
+          <w:sz w:val="22"/>
+          <w:szCs w:val="22"/>
+          <w:lang w:val="es-ES"/>
+        </w:rPr>
+        <w:t>Idioma</w:t>
+      </w:r>
+      <w:r>
+        <w:rPr>
+          <w:rFonts w:cstheme="minorHAnsi"/>
+          <w:lang w:val="es-ES"/>
+        </w:rPr>
+        <w:t xml:space="preserve">. A partir de este modelo conceptual, </w:t>
+      </w:r>
+      <w:r>
+        <w:rPr>
+          <w:rFonts w:cstheme="minorHAnsi"/>
+          <w:lang w:val="es-ES"/>
+        </w:rPr>
+        <w:t xml:space="preserve">se elaboró el </w:t>
+      </w:r>
+      <w:r>
+        <w:rPr>
+          <w:rStyle w:val="Textoennegrita"/>
+          <w:rFonts w:cstheme="minorHAnsi"/>
+          <w:b w:val="0"/>
+          <w:lang w:val="es-ES"/>
+        </w:rPr>
+        <w:t>modelo relacional</w:t>
+      </w:r>
+      <w:r>
+        <w:rPr>
+          <w:rFonts w:cstheme="minorHAnsi"/>
+          <w:lang w:val="es-ES"/>
+        </w:rPr>
+        <w:t>, definiendo las claves primarias, for</w:t>
+      </w:r>
+      <w:r>
+        <w:rPr>
+          <w:rFonts w:cstheme="minorHAnsi"/>
+          <w:lang w:val="es-ES"/>
+        </w:rPr>
+        <w:t xml:space="preserve">áneas, restricciones, obligatoriedad, así </w:t>
+      </w:r>
+      <w:r>
+        <w:rPr>
+          <w:rFonts w:cstheme="minorHAnsi"/>
+          <w:lang w:val="es-ES"/>
+        </w:rPr>
+        <w:t>validaciones lógicas med</w:t>
+      </w:r>
+      <w:r>
+        <w:rPr>
+          <w:rFonts w:cstheme="minorHAnsi"/>
+          <w:lang w:val="es-ES"/>
+        </w:rPr>
+        <w:t>iante</w:t>
+      </w:r>
+      <w:r>
+        <w:rPr>
+          <w:rFonts w:cstheme="minorHAnsi"/>
+          <w:lang w:val="es-ES"/>
+        </w:rPr>
+        <w:t xml:space="preserve"> </w:t>
+      </w:r>
+      <w:r>
+        <w:rPr>
+          <w:rStyle w:val="CdigoHTML"/>
+          <w:rFonts w:asciiTheme="minorHAnsi" w:eastAsiaTheme="minorHAnsi" w:hAnsiTheme="minorHAnsi" w:cstheme="minorHAnsi"/>
+          <w:sz w:val="22"/>
+          <w:szCs w:val="22"/>
+          <w:lang w:val="es-ES"/>
+        </w:rPr>
+        <w:t>CHECK</w:t>
+      </w:r>
+      <w:r>
+        <w:rPr>
+          <w:rStyle w:val="CdigoHTML"/>
+          <w:rFonts w:asciiTheme="minorHAnsi" w:eastAsiaTheme="minorHAnsi" w:hAnsiTheme="minorHAnsi" w:cstheme="minorHAnsi"/>
+          <w:sz w:val="22"/>
+          <w:szCs w:val="22"/>
+          <w:lang w:val="es-ES"/>
+        </w:rPr>
+        <w:t xml:space="preserve">. </w:t>
+      </w:r>
+      <w:r>
+        <w:rPr>
+          <w:rFonts w:cstheme="minorHAnsi"/>
+          <w:lang w:val="es-ES"/>
+        </w:rPr>
+        <w:t>Las tablas fueron creadas utilizando SQL</w:t>
+      </w:r>
+    </w:p>
+    <w:p>
+      <w:pPr>
+        <w:rPr>
+          <w:b/>
+          <w:lang w:val="es-ES"/>
+        </w:rPr>
+      </w:pPr>
+      <w:r>
+        <w:rPr>
+          <w:b/>
+          <w:lang w:val="es-ES"/>
+        </w:rPr>
+        <w:t>Etapa 2 – Generación y carga masiva de datos</w:t>
+      </w:r>
+    </w:p>
+    <w:p>
+      <w:pPr>
+        <w:rPr>
+          <w:rFonts w:cstheme="minorHAnsi"/>
+          <w:lang w:val="es-ES"/>
+        </w:rPr>
+      </w:pPr>
+      <w:r>
+        <w:rPr>
+          <w:lang w:val="es-ES"/>
+        </w:rPr>
+        <w:t>Dado</w:t>
+      </w:r>
+      <w:r>
+        <w:rPr>
+          <w:rFonts w:cstheme="minorHAnsi"/>
+          <w:lang w:val="es-ES"/>
+        </w:rPr>
+        <w:t xml:space="preserve"> que no fue posible la implementación de tabla</w:t>
+      </w:r>
+      <w:r>
+        <w:rPr>
+          <w:rFonts w:cstheme="minorHAnsi"/>
+          <w:lang w:val="es-ES"/>
+        </w:rPr>
+        <w:t xml:space="preserve">s semilla, se implementó una tabla auxiliar llamada </w:t>
+      </w:r>
+      <w:proofErr w:type="spellStart"/>
+      <w:r>
+        <w:rPr>
+          <w:rFonts w:cstheme="minorHAnsi"/>
+          <w:lang w:val="es-ES"/>
+        </w:rPr>
+        <w:t>Numeros</w:t>
+      </w:r>
+      <w:proofErr w:type="spellEnd"/>
+      <w:r>
+        <w:rPr>
+          <w:rFonts w:cstheme="minorHAnsi"/>
+          <w:lang w:val="es-ES"/>
+        </w:rPr>
+        <w:t xml:space="preserve"> que permitió generar 10.000 registros</w:t>
+      </w:r>
+    </w:p>
+    <w:p>
+      <w:pPr>
+        <w:rPr>
+          <w:b/>
+          <w:sz w:val="24"/>
+          <w:szCs w:val="24"/>
+          <w:lang w:val="es-ES"/>
+        </w:rPr>
+      </w:pPr>
+      <w:r>
+        <w:rPr>
+          <w:b/>
+          <w:sz w:val="24"/>
+          <w:szCs w:val="24"/>
           <w:lang w:val="es-ES"/>
         </w:rPr>
         <w:t>Creación de la base de datos Biblioteca</w:t>
@@ -23,89 +379,15 @@
           <w:lang w:val="es-ES"/>
         </w:rPr>
       </w:pPr>
-    </w:p>
-    <w:p>
-      <w:pPr>
-        <w:rPr>
-          <w:lang w:val="es-ES"/>
-        </w:rPr>
-      </w:pPr>
-      <w:r>
-        <w:rPr>
-          <w:lang w:val="es-ES"/>
+      <w:r>
+        <w:rPr>
+          <w:noProof/>
         </w:rPr>
         <w:drawing>
           <wp:inline distT="0" distB="0" distL="0" distR="0" wp14:anchorId="7581B722" wp14:editId="2ECD9B12">
             <wp:extent cx="5612130" cy="895350"/>
             <wp:effectExtent l="0" t="0" r="7620" b="0"/>
             <wp:docPr id="2" name="Imagen 2"/>
-            <wp:cNvGraphicFramePr>
-              <a:graphicFrameLocks xmlns:a="http://schemas.openxmlformats.org/drawingml/2006/main" noChangeAspect="1"/>
-            </wp:cNvGraphicFramePr>
-            <a:graphic xmlns:a="http://schemas.openxmlformats.org/drawingml/2006/main">
-              <a:graphicData uri="http://schemas.openxmlformats.org/drawingml/2006/picture">
-                <pic:pic xmlns:pic="http://schemas.openxmlformats.org/drawingml/2006/picture">
-                  <pic:nvPicPr>
-                    <pic:cNvPr id="1" name=""/>
-                    <pic:cNvPicPr/>
-                  </pic:nvPicPr>
-                  <pic:blipFill>
-                    <a:blip r:embed="rId4"/>
-                    <a:stretch>
-                      <a:fillRect/>
-                    </a:stretch>
-                  </pic:blipFill>
-                  <pic:spPr>
-                    <a:xfrm>
-                      <a:off x="0" y="0"/>
-                      <a:ext cx="5612130" cy="895350"/>
-                    </a:xfrm>
-                    <a:prstGeom prst="rect">
-                      <a:avLst/>
-                    </a:prstGeom>
-                  </pic:spPr>
-                </pic:pic>
-              </a:graphicData>
-            </a:graphic>
-          </wp:inline>
-        </w:drawing>
-      </w:r>
-    </w:p>
-    <w:p>
-      <w:pPr>
-        <w:rPr>
-          <w:lang w:val="es-ES"/>
-        </w:rPr>
-      </w:pPr>
-    </w:p>
-    <w:p>
-      <w:pPr>
-        <w:rPr>
-          <w:lang w:val="es-ES"/>
-        </w:rPr>
-      </w:pPr>
-      <w:r>
-        <w:rPr>
-          <w:lang w:val="es-ES"/>
-        </w:rPr>
-        <w:t xml:space="preserve">Selección de la base de datos para la creación de las tablas </w:t>
-      </w:r>
-    </w:p>
-    <w:p>
-      <w:pPr>
-        <w:rPr>
-          <w:lang w:val="es-ES"/>
-        </w:rPr>
-      </w:pPr>
-      <w:r>
-        <w:rPr>
-          <w:lang w:val="es-ES"/>
-        </w:rPr>
-        <w:drawing>
-          <wp:inline distT="0" distB="0" distL="0" distR="0" wp14:anchorId="43F63859" wp14:editId="766AE0DD">
-            <wp:extent cx="5612130" cy="652145"/>
-            <wp:effectExtent l="0" t="0" r="7620" b="0"/>
-            <wp:docPr id="3" name="Imagen 3"/>
             <wp:cNvGraphicFramePr>
               <a:graphicFrameLocks xmlns:a="http://schemas.openxmlformats.org/drawingml/2006/main" noChangeAspect="1"/>
             </wp:cNvGraphicFramePr>
@@ -125,7 +407,7 @@
                   <pic:spPr>
                     <a:xfrm>
                       <a:off x="0" y="0"/>
-                      <a:ext cx="5612130" cy="652145"/>
+                      <a:ext cx="5612130" cy="895350"/>
                     </a:xfrm>
                     <a:prstGeom prst="rect">
                       <a:avLst/>
@@ -150,40 +432,24 @@
           <w:b/>
           <w:lang w:val="es-ES"/>
         </w:rPr>
-        <w:t xml:space="preserve">Creación de las tablas </w:t>
-      </w:r>
-      <w:proofErr w:type="spellStart"/>
-      <w:r>
-        <w:rPr>
-          <w:b/>
-          <w:lang w:val="es-ES"/>
-        </w:rPr>
-        <w:t>FichaBibliografica</w:t>
-      </w:r>
-      <w:proofErr w:type="spellEnd"/>
-      <w:r>
-        <w:rPr>
-          <w:b/>
-          <w:lang w:val="es-ES"/>
-        </w:rPr>
-        <w:t xml:space="preserve"> y Libro</w:t>
-      </w:r>
-    </w:p>
-    <w:p>
-      <w:pPr>
-        <w:rPr>
-          <w:lang w:val="es-ES"/>
-        </w:rPr>
-      </w:pPr>
-      <w:r>
-        <w:rPr>
-          <w:lang w:val="es-ES"/>
+        <w:t xml:space="preserve">Selección de la base de datos para la creación de las tablas </w:t>
+      </w:r>
+    </w:p>
+    <w:p>
+      <w:pPr>
+        <w:rPr>
+          <w:lang w:val="es-ES"/>
+        </w:rPr>
+      </w:pPr>
+      <w:r>
+        <w:rPr>
+          <w:noProof/>
         </w:rPr>
         <w:drawing>
-          <wp:inline distT="0" distB="0" distL="0" distR="0" wp14:anchorId="4BEC087F" wp14:editId="327BB626">
-            <wp:extent cx="5612130" cy="2200910"/>
-            <wp:effectExtent l="0" t="0" r="7620" b="8890"/>
-            <wp:docPr id="4" name="Imagen 4"/>
+          <wp:inline distT="0" distB="0" distL="0" distR="0" wp14:anchorId="43F63859" wp14:editId="766AE0DD">
+            <wp:extent cx="3892550" cy="452325"/>
+            <wp:effectExtent l="0" t="0" r="0" b="5080"/>
+            <wp:docPr id="3" name="Imagen 3"/>
             <wp:cNvGraphicFramePr>
               <a:graphicFrameLocks xmlns:a="http://schemas.openxmlformats.org/drawingml/2006/main" noChangeAspect="1"/>
             </wp:cNvGraphicFramePr>
@@ -203,7 +469,7 @@
                   <pic:spPr>
                     <a:xfrm>
                       <a:off x="0" y="0"/>
-                      <a:ext cx="5612130" cy="2200910"/>
+                      <a:ext cx="3949235" cy="458912"/>
                     </a:xfrm>
                     <a:prstGeom prst="rect">
                       <a:avLst/>
@@ -219,6 +485,146 @@
     <w:p>
       <w:pPr>
         <w:rPr>
+          <w:b/>
+          <w:lang w:val="es-ES"/>
+        </w:rPr>
+      </w:pPr>
+      <w:r>
+        <w:rPr>
+          <w:b/>
+          <w:lang w:val="es-ES"/>
+        </w:rPr>
+        <w:t xml:space="preserve">Creación de las </w:t>
+      </w:r>
+      <w:proofErr w:type="gramStart"/>
+      <w:r>
+        <w:rPr>
+          <w:b/>
+          <w:lang w:val="es-ES"/>
+        </w:rPr>
+        <w:t xml:space="preserve">tablas </w:t>
+      </w:r>
+      <w:r>
+        <w:rPr>
+          <w:b/>
+          <w:lang w:val="es-ES"/>
+        </w:rPr>
+        <w:t>:</w:t>
+      </w:r>
+      <w:proofErr w:type="gramEnd"/>
+      <w:r>
+        <w:rPr>
+          <w:b/>
+          <w:lang w:val="es-ES"/>
+        </w:rPr>
+        <w:t xml:space="preserve"> </w:t>
+      </w:r>
+      <w:r>
+        <w:rPr>
+          <w:b/>
+          <w:lang w:val="es-ES"/>
+        </w:rPr>
+        <w:t xml:space="preserve">Tabla </w:t>
+      </w:r>
+      <w:proofErr w:type="spellStart"/>
+      <w:r>
+        <w:rPr>
+          <w:b/>
+          <w:lang w:val="es-ES"/>
+        </w:rPr>
+        <w:t>FichaBibliografica</w:t>
+      </w:r>
+      <w:proofErr w:type="spellEnd"/>
+      <w:r>
+        <w:rPr>
+          <w:b/>
+          <w:lang w:val="es-ES"/>
+        </w:rPr>
+        <w:t xml:space="preserve">: </w:t>
+      </w:r>
+    </w:p>
+    <w:p>
+      <w:pPr>
+        <w:pStyle w:val="Prrafodelista"/>
+        <w:numPr>
+          <w:ilvl w:val="0"/>
+          <w:numId w:val="7"/>
+        </w:numPr>
+        <w:rPr>
+          <w:b/>
+          <w:lang w:val="es-ES"/>
+        </w:rPr>
+      </w:pPr>
+      <w:r>
+        <w:rPr>
+          <w:lang w:val="es-ES"/>
+        </w:rPr>
+        <w:t>Contiene información técnica y física del ejemplar.</w:t>
+      </w:r>
+      <w:r>
+        <w:rPr>
+          <w:lang w:val="es-ES"/>
+        </w:rPr>
+        <w:t xml:space="preserve"> </w:t>
+      </w:r>
+    </w:p>
+    <w:p>
+      <w:pPr>
+        <w:pStyle w:val="Prrafodelista"/>
+        <w:numPr>
+          <w:ilvl w:val="0"/>
+          <w:numId w:val="7"/>
+        </w:numPr>
+        <w:rPr>
+          <w:b/>
+          <w:lang w:val="es-ES"/>
+        </w:rPr>
+      </w:pPr>
+      <w:r>
+        <w:rPr>
+          <w:rFonts w:cstheme="minorHAnsi"/>
+          <w:lang w:val="es-ES"/>
+        </w:rPr>
+        <w:t xml:space="preserve">Se agregó la restricción </w:t>
+      </w:r>
+      <w:r>
+        <w:rPr>
+          <w:rStyle w:val="CdigoHTML"/>
+          <w:rFonts w:asciiTheme="minorHAnsi" w:eastAsiaTheme="minorHAnsi" w:hAnsiTheme="minorHAnsi" w:cstheme="minorHAnsi"/>
+          <w:sz w:val="22"/>
+          <w:szCs w:val="22"/>
+          <w:lang w:val="es-ES"/>
+        </w:rPr>
+        <w:t>CHECK</w:t>
+      </w:r>
+      <w:r>
+        <w:rPr>
+          <w:rFonts w:cstheme="minorHAnsi"/>
+          <w:lang w:val="es-ES"/>
+        </w:rPr>
+        <w:t xml:space="preserve"> para validar el campo </w:t>
+      </w:r>
+      <w:r>
+        <w:rPr>
+          <w:rStyle w:val="CdigoHTML"/>
+          <w:rFonts w:asciiTheme="minorHAnsi" w:eastAsiaTheme="minorHAnsi" w:hAnsiTheme="minorHAnsi" w:cstheme="minorHAnsi"/>
+          <w:sz w:val="22"/>
+          <w:szCs w:val="22"/>
+          <w:lang w:val="es-ES"/>
+        </w:rPr>
+        <w:t>eliminado</w:t>
+      </w:r>
+      <w:r>
+        <w:rPr>
+          <w:rFonts w:cstheme="minorHAnsi"/>
+          <w:lang w:val="es-ES"/>
+        </w:rPr>
+        <w:t>.</w:t>
+      </w:r>
+    </w:p>
+    <w:p>
+      <w:pPr>
+        <w:rPr>
           <w:lang w:val="es-ES"/>
         </w:rPr>
       </w:pPr>
@@ -227,10 +633,18 @@
           <w:lang w:val="es-ES"/>
         </w:rPr>
         <w:drawing>
-          <wp:inline distT="0" distB="0" distL="0" distR="0" wp14:anchorId="3D99D9E8" wp14:editId="1D88AA4E">
-            <wp:extent cx="5612130" cy="2616835"/>
-            <wp:effectExtent l="0" t="0" r="7620" b="0"/>
-            <wp:docPr id="5" name="Imagen 5"/>
+          <wp:anchor distT="0" distB="0" distL="114300" distR="114300" simplePos="0" relativeHeight="251660288" behindDoc="0" locked="0" layoutInCell="1" allowOverlap="1">
+            <wp:simplePos x="0" y="0"/>
+            <wp:positionH relativeFrom="column">
+              <wp:posOffset>583565</wp:posOffset>
+            </wp:positionH>
+            <wp:positionV relativeFrom="paragraph">
+              <wp:posOffset>238125</wp:posOffset>
+            </wp:positionV>
+            <wp:extent cx="3280410" cy="1666240"/>
+            <wp:effectExtent l="0" t="0" r="0" b="0"/>
+            <wp:wrapNone/>
+            <wp:docPr id="8" name="Imagen 8"/>
             <wp:cNvGraphicFramePr>
               <a:graphicFrameLocks xmlns:a="http://schemas.openxmlformats.org/drawingml/2006/main" noChangeAspect="1"/>
             </wp:cNvGraphicFramePr>
@@ -242,7 +656,13 @@
                     <pic:cNvPicPr/>
                   </pic:nvPicPr>
                   <pic:blipFill>
-                    <a:blip r:embed="rId7"/>
+                    <a:blip r:embed="rId7">
+                      <a:extLst>
+                        <a:ext uri="{28A0092B-C50C-407E-A947-70E740481C1C}">
+                          <a14:useLocalDpi xmlns:a14="http://schemas.microsoft.com/office/drawing/2010/main" val="0"/>
+                        </a:ext>
+                      </a:extLst>
+                    </a:blip>
                     <a:stretch>
                       <a:fillRect/>
                     </a:stretch>
@@ -250,7 +670,508 @@
                   <pic:spPr>
                     <a:xfrm>
                       <a:off x="0" y="0"/>
-                      <a:ext cx="5612130" cy="2616835"/>
+                      <a:ext cx="3280410" cy="1666240"/>
+                    </a:xfrm>
+                    <a:prstGeom prst="rect">
+                      <a:avLst/>
+                    </a:prstGeom>
+                  </pic:spPr>
+                </pic:pic>
+              </a:graphicData>
+            </a:graphic>
+          </wp:anchor>
+        </w:drawing>
+      </w:r>
+    </w:p>
+    <w:p>
+      <w:pPr>
+        <w:rPr>
+          <w:lang w:val="es-ES"/>
+        </w:rPr>
+      </w:pPr>
+    </w:p>
+    <w:p>
+      <w:pPr>
+        <w:rPr>
+          <w:lang w:val="es-ES"/>
+        </w:rPr>
+      </w:pPr>
+    </w:p>
+    <w:p>
+      <w:pPr>
+        <w:rPr>
+          <w:lang w:val="es-ES"/>
+        </w:rPr>
+      </w:pPr>
+    </w:p>
+    <w:p>
+      <w:pPr>
+        <w:rPr>
+          <w:lang w:val="es-ES"/>
+        </w:rPr>
+      </w:pPr>
+    </w:p>
+    <w:p>
+      <w:pPr>
+        <w:rPr>
+          <w:lang w:val="es-ES"/>
+        </w:rPr>
+      </w:pPr>
+    </w:p>
+    <w:p>
+      <w:pPr>
+        <w:rPr>
+          <w:b/>
+          <w:lang w:val="es-ES"/>
+        </w:rPr>
+      </w:pPr>
+    </w:p>
+    <w:p>
+      <w:pPr>
+        <w:rPr>
+          <w:b/>
+          <w:lang w:val="es-ES"/>
+        </w:rPr>
+      </w:pPr>
+      <w:r>
+        <w:rPr>
+          <w:b/>
+          <w:lang w:val="es-ES"/>
+        </w:rPr>
+        <w:t xml:space="preserve">Tabla Libro </w:t>
+      </w:r>
+    </w:p>
+    <w:p>
+      <w:pPr>
+        <w:pStyle w:val="Prrafodelista"/>
+        <w:numPr>
+          <w:ilvl w:val="0"/>
+          <w:numId w:val="4"/>
+        </w:numPr>
+        <w:rPr>
+          <w:b/>
+          <w:lang w:val="es-ES"/>
+        </w:rPr>
+      </w:pPr>
+      <w:proofErr w:type="spellStart"/>
+      <w:r>
+        <w:t>Representa</w:t>
+      </w:r>
+      <w:proofErr w:type="spellEnd"/>
+      <w:r>
+        <w:t xml:space="preserve"> </w:t>
+      </w:r>
+      <w:proofErr w:type="spellStart"/>
+      <w:r>
+        <w:t>cada</w:t>
+      </w:r>
+      <w:proofErr w:type="spellEnd"/>
+      <w:r>
+        <w:t xml:space="preserve"> </w:t>
+      </w:r>
+      <w:proofErr w:type="spellStart"/>
+      <w:r>
+        <w:t>obra</w:t>
+      </w:r>
+      <w:proofErr w:type="spellEnd"/>
+      <w:r>
+        <w:t xml:space="preserve"> </w:t>
+      </w:r>
+      <w:proofErr w:type="spellStart"/>
+      <w:r>
+        <w:t>registrada</w:t>
+      </w:r>
+      <w:proofErr w:type="spellEnd"/>
+      <w:r>
+        <w:t>.</w:t>
+      </w:r>
+    </w:p>
+    <w:p>
+      <w:pPr>
+        <w:pStyle w:val="Prrafodelista"/>
+        <w:numPr>
+          <w:ilvl w:val="0"/>
+          <w:numId w:val="4"/>
+        </w:numPr>
+        <w:rPr>
+          <w:rStyle w:val="CdigoHTML"/>
+          <w:rFonts w:asciiTheme="minorHAnsi" w:eastAsiaTheme="minorHAnsi" w:hAnsiTheme="minorHAnsi" w:cstheme="minorHAnsi"/>
+          <w:b/>
+          <w:sz w:val="22"/>
+          <w:szCs w:val="22"/>
+          <w:lang w:val="es-ES"/>
+        </w:rPr>
+      </w:pPr>
+      <w:r>
+        <w:rPr>
+          <w:rFonts w:cstheme="minorHAnsi"/>
+          <w:lang w:val="es-ES"/>
+        </w:rPr>
+        <w:t>S</w:t>
+      </w:r>
+      <w:r>
+        <w:rPr>
+          <w:rFonts w:cstheme="minorHAnsi"/>
+          <w:lang w:val="es-ES"/>
+        </w:rPr>
+        <w:t xml:space="preserve">e relaciona 1:1 con </w:t>
+      </w:r>
+      <w:proofErr w:type="spellStart"/>
+      <w:r>
+        <w:rPr>
+          <w:rStyle w:val="CdigoHTML"/>
+          <w:rFonts w:asciiTheme="minorHAnsi" w:eastAsiaTheme="minorHAnsi" w:hAnsiTheme="minorHAnsi" w:cstheme="minorHAnsi"/>
+          <w:sz w:val="22"/>
+          <w:szCs w:val="22"/>
+          <w:lang w:val="es-ES"/>
+        </w:rPr>
+        <w:t>FichaBibliografica</w:t>
+      </w:r>
+      <w:proofErr w:type="spellEnd"/>
+      <w:r>
+        <w:rPr>
+          <w:rFonts w:cstheme="minorHAnsi"/>
+          <w:lang w:val="es-ES"/>
+        </w:rPr>
+        <w:t xml:space="preserve"> mediante </w:t>
+      </w:r>
+      <w:proofErr w:type="spellStart"/>
+      <w:r>
+        <w:rPr>
+          <w:rStyle w:val="CdigoHTML"/>
+          <w:rFonts w:asciiTheme="minorHAnsi" w:eastAsiaTheme="minorHAnsi" w:hAnsiTheme="minorHAnsi" w:cstheme="minorHAnsi"/>
+          <w:sz w:val="22"/>
+          <w:szCs w:val="22"/>
+          <w:lang w:val="es-ES"/>
+        </w:rPr>
+        <w:t>id_ficha</w:t>
+      </w:r>
+      <w:proofErr w:type="spellEnd"/>
+    </w:p>
+    <w:p>
+      <w:pPr>
+        <w:pStyle w:val="Prrafodelista"/>
+        <w:numPr>
+          <w:ilvl w:val="0"/>
+          <w:numId w:val="4"/>
+        </w:numPr>
+        <w:rPr>
+          <w:rStyle w:val="CdigoHTML"/>
+          <w:rFonts w:asciiTheme="minorHAnsi" w:eastAsiaTheme="minorHAnsi" w:hAnsiTheme="minorHAnsi" w:cstheme="minorHAnsi"/>
+          <w:b/>
+          <w:sz w:val="22"/>
+          <w:szCs w:val="22"/>
+          <w:lang w:val="es-ES"/>
+        </w:rPr>
+      </w:pPr>
+      <w:r>
+        <w:rPr>
+          <w:rFonts w:cstheme="minorHAnsi"/>
+          <w:lang w:val="es-ES"/>
+        </w:rPr>
+        <w:t>R</w:t>
+      </w:r>
+      <w:r>
+        <w:rPr>
+          <w:rFonts w:cstheme="minorHAnsi"/>
+          <w:lang w:val="es-ES"/>
+        </w:rPr>
+        <w:t xml:space="preserve">estricciones </w:t>
+      </w:r>
+      <w:r>
+        <w:rPr>
+          <w:rStyle w:val="CdigoHTML"/>
+          <w:rFonts w:asciiTheme="minorHAnsi" w:eastAsiaTheme="minorHAnsi" w:hAnsiTheme="minorHAnsi" w:cstheme="minorHAnsi"/>
+          <w:sz w:val="22"/>
+          <w:szCs w:val="22"/>
+          <w:lang w:val="es-ES"/>
+        </w:rPr>
+        <w:t>CHECK</w:t>
+      </w:r>
+      <w:r>
+        <w:rPr>
+          <w:rFonts w:cstheme="minorHAnsi"/>
+          <w:lang w:val="es-ES"/>
+        </w:rPr>
+        <w:t xml:space="preserve"> para validar el campo </w:t>
+      </w:r>
+      <w:r>
+        <w:rPr>
+          <w:rStyle w:val="CdigoHTML"/>
+          <w:rFonts w:asciiTheme="minorHAnsi" w:eastAsiaTheme="minorHAnsi" w:hAnsiTheme="minorHAnsi" w:cstheme="minorHAnsi"/>
+          <w:sz w:val="22"/>
+          <w:szCs w:val="22"/>
+          <w:lang w:val="es-ES"/>
+        </w:rPr>
+        <w:t>eliminado</w:t>
+      </w:r>
+      <w:r>
+        <w:rPr>
+          <w:rFonts w:cstheme="minorHAnsi"/>
+          <w:lang w:val="es-ES"/>
+        </w:rPr>
+        <w:t xml:space="preserve"> y el rango de años de edición.</w:t>
+      </w:r>
+    </w:p>
+    <w:p>
+      <w:pPr>
+        <w:rPr>
+          <w:b/>
+          <w:lang w:val="es-ES"/>
+        </w:rPr>
+      </w:pPr>
+      <w:r>
+        <w:rPr>
+          <w:b/>
+          <w:lang w:val="es-ES"/>
+        </w:rPr>
+        <w:drawing>
+          <wp:anchor distT="0" distB="0" distL="114300" distR="114300" simplePos="0" relativeHeight="251661312" behindDoc="0" locked="0" layoutInCell="1" allowOverlap="1">
+            <wp:simplePos x="0" y="0"/>
+            <wp:positionH relativeFrom="column">
+              <wp:posOffset>488315</wp:posOffset>
+            </wp:positionH>
+            <wp:positionV relativeFrom="paragraph">
+              <wp:posOffset>180340</wp:posOffset>
+            </wp:positionV>
+            <wp:extent cx="3853180" cy="2060871"/>
+            <wp:effectExtent l="0" t="0" r="0" b="0"/>
+            <wp:wrapNone/>
+            <wp:docPr id="23" name="Imagen 23"/>
+            <wp:cNvGraphicFramePr>
+              <a:graphicFrameLocks xmlns:a="http://schemas.openxmlformats.org/drawingml/2006/main" noChangeAspect="1"/>
+            </wp:cNvGraphicFramePr>
+            <a:graphic xmlns:a="http://schemas.openxmlformats.org/drawingml/2006/main">
+              <a:graphicData uri="http://schemas.openxmlformats.org/drawingml/2006/picture">
+                <pic:pic xmlns:pic="http://schemas.openxmlformats.org/drawingml/2006/picture">
+                  <pic:nvPicPr>
+                    <pic:cNvPr id="1" name=""/>
+                    <pic:cNvPicPr/>
+                  </pic:nvPicPr>
+                  <pic:blipFill>
+                    <a:blip r:embed="rId8">
+                      <a:extLst>
+                        <a:ext uri="{28A0092B-C50C-407E-A947-70E740481C1C}">
+                          <a14:useLocalDpi xmlns:a14="http://schemas.microsoft.com/office/drawing/2010/main" val="0"/>
+                        </a:ext>
+                      </a:extLst>
+                    </a:blip>
+                    <a:stretch>
+                      <a:fillRect/>
+                    </a:stretch>
+                  </pic:blipFill>
+                  <pic:spPr>
+                    <a:xfrm>
+                      <a:off x="0" y="0"/>
+                      <a:ext cx="3853180" cy="2060871"/>
+                    </a:xfrm>
+                    <a:prstGeom prst="rect">
+                      <a:avLst/>
+                    </a:prstGeom>
+                  </pic:spPr>
+                </pic:pic>
+              </a:graphicData>
+            </a:graphic>
+          </wp:anchor>
+        </w:drawing>
+      </w:r>
+    </w:p>
+    <w:p>
+      <w:pPr>
+        <w:rPr>
+          <w:b/>
+          <w:lang w:val="es-ES"/>
+        </w:rPr>
+      </w:pPr>
+    </w:p>
+    <w:p>
+      <w:pPr>
+        <w:rPr>
+          <w:b/>
+          <w:lang w:val="es-ES"/>
+        </w:rPr>
+      </w:pPr>
+    </w:p>
+    <w:p>
+      <w:pPr>
+        <w:pStyle w:val="Prrafodelista"/>
+        <w:numPr>
+          <w:ilvl w:val="0"/>
+          <w:numId w:val="4"/>
+        </w:numPr>
+        <w:rPr>
+          <w:lang w:val="es-ES"/>
+        </w:rPr>
+      </w:pPr>
+    </w:p>
+    <w:p>
+      <w:pPr>
+        <w:rPr>
+          <w:rStyle w:val="Textoennegrita"/>
+          <w:lang w:val="es-ES"/>
+        </w:rPr>
+      </w:pPr>
+    </w:p>
+    <w:p>
+      <w:pPr>
+        <w:pStyle w:val="NormalWeb"/>
+        <w:rPr>
+          <w:rStyle w:val="Textoennegrita"/>
+          <w:rFonts w:asciiTheme="minorHAnsi" w:eastAsiaTheme="minorHAnsi" w:hAnsiTheme="minorHAnsi" w:cstheme="minorBidi"/>
+          <w:sz w:val="22"/>
+          <w:szCs w:val="22"/>
+          <w:lang w:val="es-ES"/>
+        </w:rPr>
+      </w:pPr>
+    </w:p>
+    <w:p>
+      <w:pPr>
+        <w:pStyle w:val="NormalWeb"/>
+        <w:rPr>
+          <w:rStyle w:val="Textoennegrita"/>
+          <w:lang w:val="es-ES"/>
+        </w:rPr>
+      </w:pPr>
+    </w:p>
+    <w:p>
+      <w:pPr>
+        <w:pStyle w:val="NormalWeb"/>
+        <w:rPr>
+          <w:rStyle w:val="Textoennegrita"/>
+          <w:lang w:val="es-ES"/>
+        </w:rPr>
+      </w:pPr>
+    </w:p>
+    <w:p>
+      <w:pPr>
+        <w:pStyle w:val="NormalWeb"/>
+        <w:rPr>
+          <w:rStyle w:val="Textoennegrita"/>
+          <w:lang w:val="es-ES"/>
+        </w:rPr>
+      </w:pPr>
+    </w:p>
+    <w:p>
+      <w:pPr>
+        <w:pStyle w:val="NormalWeb"/>
+        <w:rPr>
+          <w:lang w:val="es-ES"/>
+        </w:rPr>
+      </w:pPr>
+      <w:r>
+        <w:rPr>
+          <w:rStyle w:val="Textoennegrita"/>
+          <w:lang w:val="es-ES"/>
+        </w:rPr>
+        <w:t xml:space="preserve">Tabla idioma </w:t>
+      </w:r>
+      <w:r>
+        <w:rPr>
+          <w:rStyle w:val="Textoennegrita"/>
+          <w:lang w:val="es-ES"/>
+        </w:rPr>
+        <w:br/>
+      </w:r>
+      <w:r>
+        <w:rPr>
+          <w:rFonts w:hAnsi="Symbol"/>
+          <w:lang w:val="es-ES"/>
+        </w:rPr>
+        <w:t>-</w:t>
+      </w:r>
+      <w:r>
+        <w:rPr>
+          <w:lang w:val="es-ES"/>
+        </w:rPr>
+        <w:t xml:space="preserve">  Representa los idiomas disponibles en la biblioteca.</w:t>
+      </w:r>
+    </w:p>
+    <w:p>
+      <w:pPr>
+        <w:spacing w:before="100" w:beforeAutospacing="1" w:after="100" w:afterAutospacing="1" w:line="240" w:lineRule="auto"/>
+        <w:rPr>
+          <w:rFonts w:ascii="Times New Roman" w:eastAsia="Times New Roman" w:hAnsi="Times New Roman" w:cs="Times New Roman"/>
+          <w:sz w:val="24"/>
+          <w:szCs w:val="24"/>
+          <w:lang w:val="es-ES"/>
+        </w:rPr>
+      </w:pPr>
+      <w:r>
+        <w:rPr>
+          <w:rFonts w:ascii="Times New Roman" w:eastAsia="Times New Roman" w:hAnsi="Times New Roman" w:cs="Times New Roman"/>
+          <w:sz w:val="24"/>
+          <w:szCs w:val="24"/>
+          <w:lang w:val="es-ES"/>
+        </w:rPr>
+        <w:t>-</w:t>
+      </w:r>
+      <w:r>
+        <w:rPr>
+          <w:rFonts w:ascii="Times New Roman" w:eastAsia="Times New Roman" w:hAnsi="Times New Roman" w:cs="Times New Roman"/>
+          <w:sz w:val="24"/>
+          <w:szCs w:val="24"/>
+          <w:lang w:val="es-ES"/>
+        </w:rPr>
+        <w:t xml:space="preserve"> Se insertaron los valores: </w:t>
+      </w:r>
+      <w:proofErr w:type="gramStart"/>
+      <w:r>
+        <w:rPr>
+          <w:rFonts w:ascii="Times New Roman" w:eastAsia="Times New Roman" w:hAnsi="Times New Roman" w:cs="Times New Roman"/>
+          <w:sz w:val="24"/>
+          <w:szCs w:val="24"/>
+          <w:lang w:val="es-ES"/>
+        </w:rPr>
+        <w:t>Español</w:t>
+      </w:r>
+      <w:proofErr w:type="gramEnd"/>
+      <w:r>
+        <w:rPr>
+          <w:rFonts w:ascii="Times New Roman" w:eastAsia="Times New Roman" w:hAnsi="Times New Roman" w:cs="Times New Roman"/>
+          <w:sz w:val="24"/>
+          <w:szCs w:val="24"/>
+          <w:lang w:val="es-ES"/>
+        </w:rPr>
+        <w:t>, Inglés, Francés y Alemán</w:t>
+      </w:r>
+    </w:p>
+    <w:p>
+      <w:pPr>
+        <w:rPr>
+          <w:rStyle w:val="Textoennegrita"/>
+          <w:lang w:val="es-ES"/>
+        </w:rPr>
+      </w:pPr>
+      <w:r>
+        <w:rPr>
+          <w:rStyle w:val="Textoennegrita"/>
+          <w:lang w:val="es-ES"/>
+        </w:rPr>
+        <w:drawing>
+          <wp:inline distT="0" distB="0" distL="0" distR="0" wp14:anchorId="58CB66B9" wp14:editId="69E1A138">
+            <wp:extent cx="4108450" cy="2239705"/>
+            <wp:effectExtent l="0" t="0" r="6350" b="8255"/>
+            <wp:docPr id="6" name="Imagen 6"/>
+            <wp:cNvGraphicFramePr>
+              <a:graphicFrameLocks xmlns:a="http://schemas.openxmlformats.org/drawingml/2006/main" noChangeAspect="1"/>
+            </wp:cNvGraphicFramePr>
+            <a:graphic xmlns:a="http://schemas.openxmlformats.org/drawingml/2006/main">
+              <a:graphicData uri="http://schemas.openxmlformats.org/drawingml/2006/picture">
+                <pic:pic xmlns:pic="http://schemas.openxmlformats.org/drawingml/2006/picture">
+                  <pic:nvPicPr>
+                    <pic:cNvPr id="1" name=""/>
+                    <pic:cNvPicPr/>
+                  </pic:nvPicPr>
+                  <pic:blipFill>
+                    <a:blip r:embed="rId9"/>
+                    <a:stretch>
+                      <a:fillRect/>
+                    </a:stretch>
+                  </pic:blipFill>
+                  <pic:spPr>
+                    <a:xfrm>
+                      <a:off x="0" y="0"/>
+                      <a:ext cx="4118468" cy="2245166"/>
                     </a:xfrm>
                     <a:prstGeom prst="rect">
                       <a:avLst/>
@@ -266,37 +1187,66 @@
     <w:p>
       <w:pPr>
         <w:rPr>
-          <w:lang w:val="es-ES"/>
-        </w:rPr>
-      </w:pPr>
-    </w:p>
-    <w:p>
-      <w:pPr>
-        <w:rPr>
-          <w:lang w:val="es-ES"/>
-        </w:rPr>
-      </w:pPr>
-    </w:p>
-    <w:p>
-      <w:pPr>
-        <w:rPr>
-          <w:lang w:val="es-ES"/>
-        </w:rPr>
-      </w:pPr>
-      <w:r>
-        <w:rPr>
           <w:rStyle w:val="Textoennegrita"/>
           <w:lang w:val="es-ES"/>
         </w:rPr>
+      </w:pPr>
+    </w:p>
+    <w:p>
+      <w:pPr>
+        <w:rPr>
+          <w:rStyle w:val="Textoennegrita"/>
+          <w:lang w:val="es-ES"/>
+        </w:rPr>
+      </w:pPr>
+    </w:p>
+    <w:p>
+      <w:pPr>
+        <w:rPr>
+          <w:rStyle w:val="Textoennegrita"/>
+          <w:lang w:val="es-ES"/>
+        </w:rPr>
+      </w:pPr>
+    </w:p>
+    <w:p>
+      <w:pPr>
+        <w:jc w:val="center"/>
+        <w:rPr>
+          <w:rStyle w:val="Textoennegrita"/>
+          <w:lang w:val="es-ES"/>
+        </w:rPr>
+      </w:pPr>
+      <w:r>
+        <w:rPr>
+          <w:rStyle w:val="Textoennegrita"/>
+          <w:lang w:val="es-ES"/>
+        </w:rPr>
+        <w:lastRenderedPageBreak/>
         <w:t>Modelo DER (Diagrama Entidad-Relación)</w:t>
       </w:r>
     </w:p>
     <w:p>
-      <w:r>
+      <w:pPr>
+        <w:rPr>
+          <w:rStyle w:val="Textoennegrita"/>
+          <w:lang w:val="es-ES"/>
+        </w:rPr>
+      </w:pPr>
+    </w:p>
+    <w:p>
+      <w:pPr>
+        <w:rPr>
+          <w:lang w:val="es-ES"/>
+        </w:rPr>
+      </w:pPr>
+      <w:r>
+        <w:rPr>
+          <w:noProof/>
+        </w:rPr>
         <w:drawing>
-          <wp:inline distT="0" distB="0" distL="0" distR="0" wp14:anchorId="30969E81" wp14:editId="62FCC31D">
-            <wp:extent cx="5612130" cy="4223385"/>
-            <wp:effectExtent l="0" t="0" r="7620" b="5715"/>
+          <wp:inline distT="0" distB="0" distL="0" distR="0" wp14:anchorId="71805EAD" wp14:editId="1355C4D0">
+            <wp:extent cx="5612130" cy="3044190"/>
+            <wp:effectExtent l="0" t="0" r="7620" b="3810"/>
             <wp:docPr id="1" name="Imagen 1"/>
             <wp:cNvGraphicFramePr>
               <a:graphicFrameLocks xmlns:a="http://schemas.openxmlformats.org/drawingml/2006/main" noChangeAspect="1"/>
@@ -309,7 +1259,7 @@
                     <pic:cNvPicPr/>
                   </pic:nvPicPr>
                   <pic:blipFill>
-                    <a:blip r:embed="rId8"/>
+                    <a:blip r:embed="rId10"/>
                     <a:stretch>
                       <a:fillRect/>
                     </a:stretch>
@@ -317,7 +1267,7 @@
                   <pic:spPr>
                     <a:xfrm>
                       <a:off x="0" y="0"/>
-                      <a:ext cx="5612130" cy="4223385"/>
+                      <a:ext cx="5612130" cy="3044190"/>
                     </a:xfrm>
                     <a:prstGeom prst="rect">
                       <a:avLst/>
@@ -330,9 +1280,16 @@
         </w:drawing>
       </w:r>
     </w:p>
-    <w:p/>
-    <w:p>
-      <w:pPr>
+    <w:p>
+      <w:pPr>
+        <w:rPr>
+          <w:lang w:val="es-ES"/>
+        </w:rPr>
+      </w:pPr>
+    </w:p>
+    <w:p>
+      <w:pPr>
+        <w:jc w:val="center"/>
         <w:rPr>
           <w:b/>
           <w:sz w:val="24"/>
@@ -349,29 +1306,27 @@
         </w:rPr>
         <w:t>Modelo relacional</w:t>
       </w:r>
-      <w:r>
-        <w:rPr>
-          <w:b/>
-          <w:sz w:val="24"/>
-          <w:szCs w:val="24"/>
+    </w:p>
+    <w:p>
+      <w:pPr>
+        <w:rPr>
+          <w:b/>
+          <w:lang w:val="es-ES"/>
+        </w:rPr>
+      </w:pPr>
+      <w:r>
+        <w:rPr>
+          <w:b/>
+          <w:lang w:val="es-ES"/>
+        </w:rPr>
+        <w:t>Entidad</w:t>
+      </w:r>
+      <w:r>
+        <w:rPr>
+          <w:b/>
           <w:lang w:val="es-ES"/>
         </w:rPr>
         <w:t xml:space="preserve"> </w:t>
-      </w:r>
-    </w:p>
-    <w:p>
-      <w:pPr>
-        <w:rPr>
-          <w:b/>
-          <w:lang w:val="es-ES"/>
-        </w:rPr>
-      </w:pPr>
-      <w:r>
-        <w:rPr>
-          <w:b/>
-          <w:lang w:val="es-ES"/>
-        </w:rPr>
-        <w:t xml:space="preserve">ENTIDAD </w:t>
       </w:r>
       <w:proofErr w:type="spellStart"/>
       <w:r>
@@ -689,19 +1644,7 @@
               <w:rPr>
                 <w:b/>
               </w:rPr>
-              <w:t xml:space="preserve">Varchar </w:t>
-            </w:r>
-            <w:r>
-              <w:rPr>
-                <w:b/>
-              </w:rPr>
-              <w:t>(20</w:t>
-            </w:r>
-            <w:r>
-              <w:rPr>
-                <w:b/>
-              </w:rPr>
-              <w:t>)</w:t>
+              <w:t>Varchar (20)</w:t>
             </w:r>
           </w:p>
         </w:tc>
@@ -770,7 +1713,10 @@
           <w:p>
             <w:proofErr w:type="spellStart"/>
             <w:r>
-              <w:t>Idioma</w:t>
+              <w:t>Id_i</w:t>
+            </w:r>
+            <w:r>
+              <w:t>dioma</w:t>
             </w:r>
             <w:proofErr w:type="spellEnd"/>
           </w:p>
@@ -789,19 +1735,7 @@
               <w:rPr>
                 <w:b/>
               </w:rPr>
-              <w:t>Varchar (</w:t>
-            </w:r>
-            <w:r>
-              <w:rPr>
-                <w:b/>
-              </w:rPr>
-              <w:t>3</w:t>
-            </w:r>
-            <w:r>
-              <w:rPr>
-                <w:b/>
-              </w:rPr>
-              <w:t>0)</w:t>
+              <w:t>Varchar (30)</w:t>
             </w:r>
           </w:p>
         </w:tc>
@@ -815,6 +1749,12 @@
                 <w:b/>
               </w:rPr>
             </w:pPr>
+            <w:r>
+              <w:rPr>
+                <w:b/>
+              </w:rPr>
+              <w:t>Foreign key</w:t>
+            </w:r>
           </w:p>
         </w:tc>
       </w:tr>
@@ -850,7 +1790,6 @@
           <w:sz w:val="24"/>
           <w:szCs w:val="24"/>
         </w:rPr>
-        <w:lastRenderedPageBreak/>
         <w:fldChar w:fldCharType="begin"/>
       </w:r>
       <w:r>
@@ -931,6 +1870,7 @@
           <w:b/>
           <w:lang w:val="es-ES"/>
         </w:rPr>
+        <w:lastRenderedPageBreak/>
         <w:t>Entidad Libro</w:t>
       </w:r>
       <w:r>
@@ -1314,13 +2254,7 @@
               </w:rPr>
             </w:pPr>
             <w:r>
-              <w:t>VARCHAR(1</w:t>
-            </w:r>
-            <w:r>
-              <w:t>0</w:t>
-            </w:r>
-            <w:r>
-              <w:t>0)</w:t>
+              <w:t>VARCHAR(100)</w:t>
             </w:r>
           </w:p>
         </w:tc>
@@ -1454,6 +2388,253 @@
           <w:b/>
         </w:rPr>
       </w:pPr>
+    </w:p>
+    <w:p>
+      <w:pPr>
+        <w:rPr>
+          <w:b/>
+          <w:lang w:val="es-ES"/>
+        </w:rPr>
+      </w:pPr>
+      <w:r>
+        <w:rPr>
+          <w:b/>
+          <w:lang w:val="es-ES"/>
+        </w:rPr>
+        <w:t>Entidad Idioma</w:t>
+      </w:r>
+      <w:r>
+        <w:rPr>
+          <w:b/>
+          <w:lang w:val="es-ES"/>
+        </w:rPr>
+        <w:t xml:space="preserve"> </w:t>
+      </w:r>
+      <w:r>
+        <w:rPr>
+          <w:lang w:val="es-ES"/>
+        </w:rPr>
+        <w:t>representa el conjunto de idiomas en los que puede estar escrito el libro</w:t>
+      </w:r>
+    </w:p>
+    <w:tbl>
+      <w:tblPr>
+        <w:tblStyle w:val="Tablaconcuadrcula"/>
+        <w:tblW w:w="0" w:type="auto"/>
+        <w:tblLook w:val="04A0" w:firstRow="1" w:lastRow="0" w:firstColumn="1" w:lastColumn="0" w:noHBand="0" w:noVBand="1"/>
+      </w:tblPr>
+      <w:tblGrid>
+        <w:gridCol w:w="2942"/>
+        <w:gridCol w:w="2943"/>
+        <w:gridCol w:w="2943"/>
+      </w:tblGrid>
+      <w:tr>
+        <w:tc>
+          <w:tcPr>
+            <w:tcW w:w="2942" w:type="dxa"/>
+          </w:tcPr>
+          <w:p>
+            <w:pPr>
+              <w:rPr>
+                <w:b/>
+              </w:rPr>
+            </w:pPr>
+            <w:proofErr w:type="spellStart"/>
+            <w:r>
+              <w:rPr>
+                <w:b/>
+              </w:rPr>
+              <w:t>Atributo</w:t>
+            </w:r>
+            <w:proofErr w:type="spellEnd"/>
+          </w:p>
+        </w:tc>
+        <w:tc>
+          <w:tcPr>
+            <w:tcW w:w="2943" w:type="dxa"/>
+          </w:tcPr>
+          <w:p>
+            <w:pPr>
+              <w:rPr>
+                <w:b/>
+              </w:rPr>
+            </w:pPr>
+            <w:proofErr w:type="spellStart"/>
+            <w:r>
+              <w:rPr>
+                <w:b/>
+              </w:rPr>
+              <w:t>Tipo</w:t>
+            </w:r>
+            <w:proofErr w:type="spellEnd"/>
+            <w:r>
+              <w:rPr>
+                <w:b/>
+              </w:rPr>
+              <w:t xml:space="preserve"> de </w:t>
+            </w:r>
+            <w:proofErr w:type="spellStart"/>
+            <w:r>
+              <w:rPr>
+                <w:b/>
+              </w:rPr>
+              <w:t>dato</w:t>
+            </w:r>
+            <w:proofErr w:type="spellEnd"/>
+          </w:p>
+        </w:tc>
+        <w:tc>
+          <w:tcPr>
+            <w:tcW w:w="2943" w:type="dxa"/>
+          </w:tcPr>
+          <w:p>
+            <w:pPr>
+              <w:rPr>
+                <w:b/>
+              </w:rPr>
+            </w:pPr>
+            <w:proofErr w:type="spellStart"/>
+            <w:r>
+              <w:rPr>
+                <w:b/>
+              </w:rPr>
+              <w:t>Restricciones</w:t>
+            </w:r>
+            <w:proofErr w:type="spellEnd"/>
+          </w:p>
+        </w:tc>
+      </w:tr>
+      <w:tr>
+        <w:tc>
+          <w:tcPr>
+            <w:tcW w:w="2942" w:type="dxa"/>
+          </w:tcPr>
+          <w:p>
+            <w:pPr>
+              <w:rPr>
+                <w:b/>
+              </w:rPr>
+            </w:pPr>
+            <w:proofErr w:type="spellStart"/>
+            <w:r>
+              <w:rPr>
+                <w:b/>
+              </w:rPr>
+              <w:t>Id_Idioma</w:t>
+            </w:r>
+            <w:proofErr w:type="spellEnd"/>
+          </w:p>
+        </w:tc>
+        <w:tc>
+          <w:tcPr>
+            <w:tcW w:w="2943" w:type="dxa"/>
+          </w:tcPr>
+          <w:p>
+            <w:pPr>
+              <w:rPr>
+                <w:b/>
+              </w:rPr>
+            </w:pPr>
+            <w:r>
+              <w:rPr>
+                <w:b/>
+              </w:rPr>
+              <w:t>INT</w:t>
+            </w:r>
+          </w:p>
+        </w:tc>
+        <w:tc>
+          <w:tcPr>
+            <w:tcW w:w="2943" w:type="dxa"/>
+          </w:tcPr>
+          <w:p>
+            <w:pPr>
+              <w:rPr>
+                <w:b/>
+              </w:rPr>
+            </w:pPr>
+            <w:r>
+              <w:rPr>
+                <w:b/>
+              </w:rPr>
+              <w:t>Primary Key</w:t>
+            </w:r>
+          </w:p>
+        </w:tc>
+      </w:tr>
+      <w:tr>
+        <w:tc>
+          <w:tcPr>
+            <w:tcW w:w="2942" w:type="dxa"/>
+          </w:tcPr>
+          <w:p>
+            <w:pPr>
+              <w:rPr>
+                <w:b/>
+              </w:rPr>
+            </w:pPr>
+            <w:proofErr w:type="spellStart"/>
+            <w:r>
+              <w:rPr>
+                <w:b/>
+              </w:rPr>
+              <w:t>Nombre_idioma</w:t>
+            </w:r>
+            <w:proofErr w:type="spellEnd"/>
+          </w:p>
+        </w:tc>
+        <w:tc>
+          <w:tcPr>
+            <w:tcW w:w="2943" w:type="dxa"/>
+          </w:tcPr>
+          <w:p>
+            <w:pPr>
+              <w:rPr>
+                <w:b/>
+              </w:rPr>
+            </w:pPr>
+            <w:r>
+              <w:rPr>
+                <w:b/>
+              </w:rPr>
+              <w:t>VARCHA (30)</w:t>
+            </w:r>
+          </w:p>
+        </w:tc>
+        <w:tc>
+          <w:tcPr>
+            <w:tcW w:w="2943" w:type="dxa"/>
+          </w:tcPr>
+          <w:p>
+            <w:pPr>
+              <w:rPr>
+                <w:b/>
+              </w:rPr>
+            </w:pPr>
+          </w:p>
+        </w:tc>
+      </w:tr>
+    </w:tbl>
+    <w:p>
+      <w:pPr>
+        <w:rPr>
+          <w:b/>
+        </w:rPr>
+      </w:pPr>
+    </w:p>
+    <w:p>
+      <w:pPr>
+        <w:rPr>
+          <w:b/>
+        </w:rPr>
+      </w:pPr>
+    </w:p>
+    <w:p>
+      <w:pPr>
+        <w:rPr>
+          <w:b/>
+        </w:rPr>
+      </w:pPr>
       <w:proofErr w:type="spellStart"/>
       <w:r>
         <w:rPr>
@@ -1763,13 +2944,1560 @@
           <w:lang w:val="es-ES"/>
         </w:rPr>
       </w:pPr>
+    </w:p>
+    <w:p>
+      <w:pPr>
+        <w:rPr>
+          <w:b/>
+          <w:lang w:val="es-ES"/>
+        </w:rPr>
+      </w:pPr>
+    </w:p>
+    <w:p>
+      <w:pPr>
+        <w:jc w:val="center"/>
+        <w:rPr>
+          <w:b/>
+          <w:sz w:val="30"/>
+          <w:szCs w:val="30"/>
+          <w:lang w:val="es-ES"/>
+        </w:rPr>
+      </w:pPr>
+    </w:p>
+    <w:p>
+      <w:pPr>
+        <w:jc w:val="center"/>
+        <w:rPr>
+          <w:b/>
+          <w:sz w:val="30"/>
+          <w:szCs w:val="30"/>
+          <w:lang w:val="es-ES"/>
+        </w:rPr>
+      </w:pPr>
+    </w:p>
+    <w:p>
+      <w:pPr>
+        <w:jc w:val="center"/>
+        <w:rPr>
+          <w:b/>
+          <w:sz w:val="30"/>
+          <w:szCs w:val="30"/>
+          <w:lang w:val="es-ES"/>
+        </w:rPr>
+      </w:pPr>
+    </w:p>
+    <w:p>
+      <w:pPr>
+        <w:jc w:val="center"/>
+        <w:rPr>
+          <w:b/>
+          <w:sz w:val="30"/>
+          <w:szCs w:val="30"/>
+          <w:lang w:val="es-ES"/>
+        </w:rPr>
+      </w:pPr>
+    </w:p>
+    <w:p>
+      <w:pPr>
+        <w:jc w:val="center"/>
+        <w:rPr>
+          <w:b/>
+          <w:sz w:val="30"/>
+          <w:szCs w:val="30"/>
+          <w:lang w:val="es-ES"/>
+        </w:rPr>
+      </w:pPr>
+      <w:r>
+        <w:rPr>
+          <w:b/>
+          <w:sz w:val="30"/>
+          <w:szCs w:val="30"/>
+          <w:lang w:val="es-ES"/>
+        </w:rPr>
+        <w:lastRenderedPageBreak/>
+        <w:t xml:space="preserve">Etapa 2 – Generación y carga masiva de datos </w:t>
+      </w:r>
+      <w:r>
+        <w:rPr>
+          <w:b/>
+          <w:sz w:val="30"/>
+          <w:szCs w:val="30"/>
+          <w:lang w:val="es-ES"/>
+        </w:rPr>
+        <w:t>con SQL</w:t>
+      </w:r>
+    </w:p>
+    <w:p>
+      <w:pPr>
+        <w:rPr>
+          <w:rFonts w:cstheme="minorHAnsi"/>
+          <w:lang w:val="es-ES"/>
+        </w:rPr>
+      </w:pPr>
+      <w:r>
+        <w:rPr>
+          <w:rFonts w:cstheme="minorHAnsi"/>
+          <w:lang w:val="es-ES"/>
+        </w:rPr>
+        <w:t xml:space="preserve">Dado que no fue posible utilizar tablas semilla por limitaciones técnicas del motor </w:t>
+      </w:r>
+      <w:proofErr w:type="spellStart"/>
+      <w:r>
+        <w:rPr>
+          <w:rFonts w:cstheme="minorHAnsi"/>
+          <w:lang w:val="es-ES"/>
+        </w:rPr>
+        <w:t>MySQL</w:t>
+      </w:r>
+      <w:proofErr w:type="spellEnd"/>
+      <w:r>
+        <w:rPr>
+          <w:rFonts w:cstheme="minorHAnsi"/>
+          <w:lang w:val="es-ES"/>
+        </w:rPr>
+        <w:t xml:space="preserve"> (error 1137), se implementó una estrategia alternativa basada en una tabla auxiliar llamada </w:t>
+      </w:r>
+      <w:proofErr w:type="spellStart"/>
+      <w:r>
+        <w:rPr>
+          <w:rStyle w:val="CdigoHTML"/>
+          <w:rFonts w:asciiTheme="minorHAnsi" w:eastAsiaTheme="minorHAnsi" w:hAnsiTheme="minorHAnsi" w:cstheme="minorHAnsi"/>
+          <w:sz w:val="22"/>
+          <w:szCs w:val="22"/>
+          <w:lang w:val="es-ES"/>
+        </w:rPr>
+        <w:t>Numeros</w:t>
+      </w:r>
+      <w:proofErr w:type="spellEnd"/>
+      <w:r>
+        <w:rPr>
+          <w:rFonts w:cstheme="minorHAnsi"/>
+          <w:lang w:val="es-ES"/>
+        </w:rPr>
+        <w:t>.</w:t>
+      </w:r>
+    </w:p>
+    <w:p>
+      <w:pPr>
+        <w:rPr>
+          <w:lang w:val="es-ES"/>
+        </w:rPr>
+      </w:pPr>
+    </w:p>
+    <w:p>
+      <w:pPr>
+        <w:rPr>
+          <w:b/>
+          <w:lang w:val="es-ES"/>
+        </w:rPr>
+      </w:pPr>
+      <w:r>
+        <w:rPr>
+          <w:b/>
+          <w:lang w:val="es-ES"/>
+        </w:rPr>
+        <w:t>Creación de tabla como herramienta auxiliar</w:t>
+      </w:r>
+    </w:p>
+    <w:p>
+      <w:pPr>
+        <w:rPr>
+          <w:lang w:val="es-ES"/>
+        </w:rPr>
+      </w:pPr>
+      <w:r>
+        <w:rPr>
+          <w:lang w:val="es-ES"/>
+        </w:rPr>
+        <w:t>1- Tabla auxiliar</w:t>
+      </w:r>
+      <w:r>
+        <w:rPr>
+          <w:lang w:val="es-ES"/>
+        </w:rPr>
+        <w:br/>
+        <w:t xml:space="preserve">- </w:t>
+      </w:r>
+      <w:r>
+        <w:rPr>
+          <w:lang w:val="es-ES"/>
+        </w:rPr>
+        <w:t>Se utilizó para generar los números del 0 al 9999.</w:t>
+      </w:r>
+    </w:p>
+    <w:p>
+      <w:pPr>
+        <w:rPr>
+          <w:lang w:val="es-ES"/>
+        </w:rPr>
+      </w:pPr>
+    </w:p>
+    <w:p>
+      <w:pPr>
+        <w:rPr>
+          <w:lang w:val="es-ES"/>
+        </w:rPr>
+      </w:pPr>
+      <w:r>
+        <w:rPr>
+          <w:noProof/>
+        </w:rPr>
+        <w:drawing>
+          <wp:inline distT="0" distB="0" distL="0" distR="0" wp14:anchorId="202F7E97" wp14:editId="4F22B4B1">
+            <wp:extent cx="2876550" cy="1404670"/>
+            <wp:effectExtent l="0" t="0" r="0" b="5080"/>
+            <wp:docPr id="9" name="Imagen 9"/>
+            <wp:cNvGraphicFramePr>
+              <a:graphicFrameLocks xmlns:a="http://schemas.openxmlformats.org/drawingml/2006/main" noChangeAspect="1"/>
+            </wp:cNvGraphicFramePr>
+            <a:graphic xmlns:a="http://schemas.openxmlformats.org/drawingml/2006/main">
+              <a:graphicData uri="http://schemas.openxmlformats.org/drawingml/2006/picture">
+                <pic:pic xmlns:pic="http://schemas.openxmlformats.org/drawingml/2006/picture">
+                  <pic:nvPicPr>
+                    <pic:cNvPr id="1" name=""/>
+                    <pic:cNvPicPr/>
+                  </pic:nvPicPr>
+                  <pic:blipFill>
+                    <a:blip r:embed="rId11"/>
+                    <a:stretch>
+                      <a:fillRect/>
+                    </a:stretch>
+                  </pic:blipFill>
+                  <pic:spPr>
+                    <a:xfrm>
+                      <a:off x="0" y="0"/>
+                      <a:ext cx="2879372" cy="1406048"/>
+                    </a:xfrm>
+                    <a:prstGeom prst="rect">
+                      <a:avLst/>
+                    </a:prstGeom>
+                  </pic:spPr>
+                </pic:pic>
+              </a:graphicData>
+            </a:graphic>
+          </wp:inline>
+        </w:drawing>
+      </w:r>
+    </w:p>
+    <w:p>
+      <w:pPr>
+        <w:rPr>
+          <w:lang w:val="es-ES"/>
+        </w:rPr>
+      </w:pPr>
+    </w:p>
+    <w:p>
+      <w:pPr>
+        <w:rPr>
+          <w:lang w:val="es-ES"/>
+        </w:rPr>
+      </w:pPr>
+      <w:r>
+        <w:rPr>
+          <w:lang w:val="es-ES"/>
+        </w:rPr>
+        <w:t xml:space="preserve">2- </w:t>
+      </w:r>
+      <w:proofErr w:type="spellStart"/>
+      <w:r>
+        <w:rPr>
+          <w:lang w:val="es-ES"/>
+        </w:rPr>
+        <w:t>Insert</w:t>
+      </w:r>
+      <w:proofErr w:type="spellEnd"/>
+      <w:r>
+        <w:rPr>
+          <w:lang w:val="es-ES"/>
+        </w:rPr>
+        <w:t xml:space="preserve"> en bloques. </w:t>
+      </w:r>
+    </w:p>
+    <w:p>
+      <w:pPr>
+        <w:pStyle w:val="Prrafodelista"/>
+        <w:numPr>
+          <w:ilvl w:val="0"/>
+          <w:numId w:val="4"/>
+        </w:numPr>
+        <w:rPr>
+          <w:lang w:val="es-ES"/>
+        </w:rPr>
+      </w:pPr>
+      <w:r>
+        <w:rPr>
+          <w:lang w:val="es-ES"/>
+        </w:rPr>
+        <w:t>Se genera una secuencia completa de 10.000 valores enteros.</w:t>
+      </w:r>
+    </w:p>
+    <w:p>
+      <w:r>
+        <w:rPr>
+          <w:noProof/>
+        </w:rPr>
+        <w:drawing>
+          <wp:inline distT="0" distB="0" distL="0" distR="0" wp14:anchorId="317D959C" wp14:editId="545FAA0B">
+            <wp:extent cx="5612130" cy="3083560"/>
+            <wp:effectExtent l="0" t="0" r="7620" b="2540"/>
+            <wp:docPr id="12" name="Imagen 12"/>
+            <wp:cNvGraphicFramePr>
+              <a:graphicFrameLocks xmlns:a="http://schemas.openxmlformats.org/drawingml/2006/main" noChangeAspect="1"/>
+            </wp:cNvGraphicFramePr>
+            <a:graphic xmlns:a="http://schemas.openxmlformats.org/drawingml/2006/main">
+              <a:graphicData uri="http://schemas.openxmlformats.org/drawingml/2006/picture">
+                <pic:pic xmlns:pic="http://schemas.openxmlformats.org/drawingml/2006/picture">
+                  <pic:nvPicPr>
+                    <pic:cNvPr id="1" name=""/>
+                    <pic:cNvPicPr/>
+                  </pic:nvPicPr>
+                  <pic:blipFill>
+                    <a:blip r:embed="rId12"/>
+                    <a:stretch>
+                      <a:fillRect/>
+                    </a:stretch>
+                  </pic:blipFill>
+                  <pic:spPr>
+                    <a:xfrm>
+                      <a:off x="0" y="0"/>
+                      <a:ext cx="5612130" cy="3083560"/>
+                    </a:xfrm>
+                    <a:prstGeom prst="rect">
+                      <a:avLst/>
+                    </a:prstGeom>
+                  </pic:spPr>
+                </pic:pic>
+              </a:graphicData>
+            </a:graphic>
+          </wp:inline>
+        </w:drawing>
+      </w:r>
+    </w:p>
+    <w:p>
+      <w:pPr>
+        <w:rPr>
+          <w:lang w:val="es-ES"/>
+        </w:rPr>
+      </w:pPr>
+      <w:r>
+        <w:rPr>
+          <w:lang w:val="es-ES"/>
+        </w:rPr>
+        <w:t xml:space="preserve">3- Insertar </w:t>
+      </w:r>
+      <w:r>
+        <w:rPr>
+          <w:lang w:val="es-ES"/>
+        </w:rPr>
+        <w:t xml:space="preserve">datos </w:t>
+      </w:r>
+      <w:r>
+        <w:rPr>
+          <w:lang w:val="es-ES"/>
+        </w:rPr>
+        <w:t xml:space="preserve">en </w:t>
+      </w:r>
+      <w:r>
+        <w:rPr>
+          <w:lang w:val="es-ES"/>
+        </w:rPr>
+        <w:t>tabla</w:t>
+      </w:r>
+      <w:r>
+        <w:rPr>
+          <w:lang w:val="es-ES"/>
+        </w:rPr>
+        <w:t xml:space="preserve"> </w:t>
+      </w:r>
+      <w:proofErr w:type="spellStart"/>
+      <w:r>
+        <w:rPr>
+          <w:lang w:val="es-ES"/>
+        </w:rPr>
+        <w:t>fichabibliografica</w:t>
+      </w:r>
+      <w:proofErr w:type="spellEnd"/>
+    </w:p>
+    <w:p>
+      <w:pPr>
+        <w:rPr>
+          <w:lang w:val="es-ES"/>
+        </w:rPr>
+      </w:pPr>
+    </w:p>
+    <w:p>
+      <w:pPr>
+        <w:pStyle w:val="Prrafodelista"/>
+        <w:numPr>
+          <w:ilvl w:val="0"/>
+          <w:numId w:val="4"/>
+        </w:numPr>
+        <w:rPr>
+          <w:lang w:val="es-ES"/>
+        </w:rPr>
+      </w:pPr>
+      <w:r>
+        <w:rPr>
+          <w:lang w:val="es-ES"/>
+        </w:rPr>
+        <w:lastRenderedPageBreak/>
+        <w:t>Se generan valores simulados para cada campo.</w:t>
+      </w:r>
+    </w:p>
+    <w:p>
+      <w:pPr>
+        <w:pStyle w:val="Prrafodelista"/>
+        <w:numPr>
+          <w:ilvl w:val="0"/>
+          <w:numId w:val="4"/>
+        </w:numPr>
+        <w:rPr>
+          <w:lang w:val="es-ES"/>
+        </w:rPr>
+      </w:pPr>
+      <w:proofErr w:type="spellStart"/>
+      <w:r>
+        <w:rPr>
+          <w:rStyle w:val="CdigoHTML"/>
+          <w:rFonts w:asciiTheme="minorHAnsi" w:eastAsiaTheme="minorHAnsi" w:hAnsiTheme="minorHAnsi" w:cstheme="minorHAnsi"/>
+          <w:sz w:val="22"/>
+          <w:szCs w:val="22"/>
+          <w:lang w:val="es-ES"/>
+        </w:rPr>
+        <w:t>id_idioma</w:t>
+      </w:r>
+      <w:proofErr w:type="spellEnd"/>
+      <w:r>
+        <w:rPr>
+          <w:rFonts w:cstheme="minorHAnsi"/>
+          <w:lang w:val="es-ES"/>
+        </w:rPr>
+        <w:t xml:space="preserve"> se asigna entre 1 y 4, respetando la clave foránea.</w:t>
+      </w:r>
+      <w:r>
+        <w:rPr>
+          <w:noProof/>
+        </w:rPr>
+        <w:drawing>
+          <wp:inline distT="0" distB="0" distL="0" distR="0" wp14:anchorId="2179BA7C" wp14:editId="6C30675E">
+            <wp:extent cx="5612130" cy="1793875"/>
+            <wp:effectExtent l="0" t="0" r="7620" b="0"/>
+            <wp:docPr id="13" name="Imagen 13"/>
+            <wp:cNvGraphicFramePr>
+              <a:graphicFrameLocks xmlns:a="http://schemas.openxmlformats.org/drawingml/2006/main" noChangeAspect="1"/>
+            </wp:cNvGraphicFramePr>
+            <a:graphic xmlns:a="http://schemas.openxmlformats.org/drawingml/2006/main">
+              <a:graphicData uri="http://schemas.openxmlformats.org/drawingml/2006/picture">
+                <pic:pic xmlns:pic="http://schemas.openxmlformats.org/drawingml/2006/picture">
+                  <pic:nvPicPr>
+                    <pic:cNvPr id="1" name=""/>
+                    <pic:cNvPicPr/>
+                  </pic:nvPicPr>
+                  <pic:blipFill>
+                    <a:blip r:embed="rId13"/>
+                    <a:stretch>
+                      <a:fillRect/>
+                    </a:stretch>
+                  </pic:blipFill>
+                  <pic:spPr>
+                    <a:xfrm>
+                      <a:off x="0" y="0"/>
+                      <a:ext cx="5612130" cy="1793875"/>
+                    </a:xfrm>
+                    <a:prstGeom prst="rect">
+                      <a:avLst/>
+                    </a:prstGeom>
+                  </pic:spPr>
+                </pic:pic>
+              </a:graphicData>
+            </a:graphic>
+          </wp:inline>
+        </w:drawing>
+      </w:r>
+    </w:p>
+    <w:p>
+      <w:pPr>
+        <w:rPr>
+          <w:lang w:val="es-ES"/>
+        </w:rPr>
+      </w:pPr>
+    </w:p>
+    <w:p>
+      <w:pPr>
+        <w:rPr>
+          <w:lang w:val="es-ES"/>
+        </w:rPr>
+      </w:pPr>
+      <w:r>
+        <w:rPr>
+          <w:noProof/>
+        </w:rPr>
+        <w:drawing>
+          <wp:inline distT="0" distB="0" distL="0" distR="0" wp14:anchorId="6B0AD940" wp14:editId="1A3D638A">
+            <wp:extent cx="3194050" cy="1133711"/>
+            <wp:effectExtent l="0" t="0" r="6350" b="9525"/>
+            <wp:docPr id="15" name="Imagen 15"/>
+            <wp:cNvGraphicFramePr>
+              <a:graphicFrameLocks xmlns:a="http://schemas.openxmlformats.org/drawingml/2006/main" noChangeAspect="1"/>
+            </wp:cNvGraphicFramePr>
+            <a:graphic xmlns:a="http://schemas.openxmlformats.org/drawingml/2006/main">
+              <a:graphicData uri="http://schemas.openxmlformats.org/drawingml/2006/picture">
+                <pic:pic xmlns:pic="http://schemas.openxmlformats.org/drawingml/2006/picture">
+                  <pic:nvPicPr>
+                    <pic:cNvPr id="1" name=""/>
+                    <pic:cNvPicPr/>
+                  </pic:nvPicPr>
+                  <pic:blipFill>
+                    <a:blip r:embed="rId14"/>
+                    <a:stretch>
+                      <a:fillRect/>
+                    </a:stretch>
+                  </pic:blipFill>
+                  <pic:spPr>
+                    <a:xfrm>
+                      <a:off x="0" y="0"/>
+                      <a:ext cx="3195363" cy="1134177"/>
+                    </a:xfrm>
+                    <a:prstGeom prst="rect">
+                      <a:avLst/>
+                    </a:prstGeom>
+                  </pic:spPr>
+                </pic:pic>
+              </a:graphicData>
+            </a:graphic>
+          </wp:inline>
+        </w:drawing>
+      </w:r>
+    </w:p>
+    <w:p>
+      <w:pPr>
+        <w:rPr>
+          <w:lang w:val="es-ES"/>
+        </w:rPr>
+      </w:pPr>
+    </w:p>
+    <w:p>
+      <w:pPr>
+        <w:rPr>
+          <w:lang w:val="es-ES"/>
+        </w:rPr>
+      </w:pPr>
+      <w:r>
+        <w:rPr>
+          <w:lang w:val="es-ES"/>
+        </w:rPr>
+        <w:t>4- Insertar datos en tabla libro</w:t>
+      </w:r>
+    </w:p>
+    <w:p>
+      <w:pPr>
+        <w:pStyle w:val="Prrafodelista"/>
+        <w:numPr>
+          <w:ilvl w:val="0"/>
+          <w:numId w:val="4"/>
+        </w:numPr>
+        <w:rPr>
+          <w:lang w:val="es-ES"/>
+        </w:rPr>
+      </w:pPr>
+      <w:r>
+        <w:rPr>
+          <w:lang w:val="es-ES"/>
+        </w:rPr>
+        <w:t>S</w:t>
+      </w:r>
+      <w:r>
+        <w:rPr>
+          <w:lang w:val="es-ES"/>
+        </w:rPr>
+        <w:t>e simulan títulos, autores y editoriales con funciones de texto y ASCII.</w:t>
+      </w:r>
+    </w:p>
+    <w:p>
+      <w:pPr>
+        <w:pStyle w:val="Prrafodelista"/>
+        <w:numPr>
+          <w:ilvl w:val="0"/>
+          <w:numId w:val="4"/>
+        </w:numPr>
+        <w:rPr>
+          <w:lang w:val="es-ES"/>
+        </w:rPr>
+      </w:pPr>
+      <w:r>
+        <w:rPr>
+          <w:lang w:val="es-ES"/>
+        </w:rPr>
+        <w:t>Se asignan años entre 1900 y 2024</w:t>
+      </w:r>
+    </w:p>
+    <w:p>
+      <w:pPr>
+        <w:rPr>
+          <w:lang w:val="es-ES"/>
+        </w:rPr>
+      </w:pPr>
+    </w:p>
+    <w:p>
+      <w:r>
+        <w:rPr>
+          <w:noProof/>
+        </w:rPr>
+        <w:drawing>
+          <wp:inline distT="0" distB="0" distL="0" distR="0" wp14:anchorId="0AE88492" wp14:editId="3373F1F5">
+            <wp:extent cx="5612130" cy="1743075"/>
+            <wp:effectExtent l="0" t="0" r="7620" b="9525"/>
+            <wp:docPr id="14" name="Imagen 14"/>
+            <wp:cNvGraphicFramePr>
+              <a:graphicFrameLocks xmlns:a="http://schemas.openxmlformats.org/drawingml/2006/main" noChangeAspect="1"/>
+            </wp:cNvGraphicFramePr>
+            <a:graphic xmlns:a="http://schemas.openxmlformats.org/drawingml/2006/main">
+              <a:graphicData uri="http://schemas.openxmlformats.org/drawingml/2006/picture">
+                <pic:pic xmlns:pic="http://schemas.openxmlformats.org/drawingml/2006/picture">
+                  <pic:nvPicPr>
+                    <pic:cNvPr id="1" name=""/>
+                    <pic:cNvPicPr/>
+                  </pic:nvPicPr>
+                  <pic:blipFill>
+                    <a:blip r:embed="rId15"/>
+                    <a:stretch>
+                      <a:fillRect/>
+                    </a:stretch>
+                  </pic:blipFill>
+                  <pic:spPr>
+                    <a:xfrm>
+                      <a:off x="0" y="0"/>
+                      <a:ext cx="5612130" cy="1743075"/>
+                    </a:xfrm>
+                    <a:prstGeom prst="rect">
+                      <a:avLst/>
+                    </a:prstGeom>
+                  </pic:spPr>
+                </pic:pic>
+              </a:graphicData>
+            </a:graphic>
+          </wp:inline>
+        </w:drawing>
+      </w:r>
+    </w:p>
+    <w:p/>
+    <w:p/>
+    <w:p>
+      <w:pPr>
+        <w:rPr>
+          <w:lang w:val="es-ES"/>
+        </w:rPr>
+      </w:pPr>
+      <w:r>
+        <w:rPr>
+          <w:lang w:val="es-ES"/>
+        </w:rPr>
+        <w:t xml:space="preserve">5- </w:t>
+      </w:r>
+      <w:r>
+        <w:rPr>
+          <w:lang w:val="es-ES"/>
+        </w:rPr>
+        <w:t xml:space="preserve">Validación y limpieza de tabla </w:t>
+      </w:r>
+      <w:proofErr w:type="spellStart"/>
+      <w:r>
+        <w:rPr>
+          <w:lang w:val="es-ES"/>
+        </w:rPr>
+        <w:t>Numeros</w:t>
+      </w:r>
+      <w:proofErr w:type="spellEnd"/>
+    </w:p>
+    <w:p>
+      <w:pPr>
+        <w:pStyle w:val="Prrafodelista"/>
+        <w:numPr>
+          <w:ilvl w:val="0"/>
+          <w:numId w:val="4"/>
+        </w:numPr>
+        <w:rPr>
+          <w:lang w:val="es-ES"/>
+        </w:rPr>
+      </w:pPr>
+      <w:r>
+        <w:rPr>
+          <w:lang w:val="es-ES"/>
+        </w:rPr>
+        <w:t>Se verificó que se insertaron 10.000 registros en cada tabla.</w:t>
+      </w:r>
+    </w:p>
+    <w:p>
+      <w:pPr>
+        <w:pStyle w:val="Prrafodelista"/>
+        <w:numPr>
+          <w:ilvl w:val="0"/>
+          <w:numId w:val="4"/>
+        </w:numPr>
+        <w:rPr>
+          <w:rFonts w:cstheme="minorHAnsi"/>
+          <w:lang w:val="es-ES"/>
+        </w:rPr>
+      </w:pPr>
+      <w:r>
+        <w:rPr>
+          <w:rFonts w:cstheme="minorHAnsi"/>
+          <w:lang w:val="es-ES"/>
+        </w:rPr>
+        <w:t xml:space="preserve">Se eliminó la tabla auxiliar </w:t>
+      </w:r>
+      <w:proofErr w:type="spellStart"/>
+      <w:r>
+        <w:rPr>
+          <w:rStyle w:val="CdigoHTML"/>
+          <w:rFonts w:asciiTheme="minorHAnsi" w:eastAsiaTheme="minorHAnsi" w:hAnsiTheme="minorHAnsi" w:cstheme="minorHAnsi"/>
+          <w:sz w:val="22"/>
+          <w:szCs w:val="22"/>
+          <w:lang w:val="es-ES"/>
+        </w:rPr>
+        <w:t>Numeros</w:t>
+      </w:r>
+      <w:proofErr w:type="spellEnd"/>
+      <w:r>
+        <w:rPr>
+          <w:rFonts w:cstheme="minorHAnsi"/>
+          <w:lang w:val="es-ES"/>
+        </w:rPr>
+        <w:t xml:space="preserve"> para dejar la base limpia.</w:t>
+      </w:r>
+    </w:p>
+    <w:p>
+      <w:r>
+        <w:lastRenderedPageBreak/>
+        <w:drawing>
+          <wp:inline distT="0" distB="0" distL="0" distR="0" wp14:anchorId="5E85AC6E" wp14:editId="16B4B960">
+            <wp:extent cx="3127374" cy="1190063"/>
+            <wp:effectExtent l="0" t="0" r="0" b="0"/>
+            <wp:docPr id="7" name="Imagen 7"/>
+            <wp:cNvGraphicFramePr>
+              <a:graphicFrameLocks xmlns:a="http://schemas.openxmlformats.org/drawingml/2006/main" noChangeAspect="1"/>
+            </wp:cNvGraphicFramePr>
+            <a:graphic xmlns:a="http://schemas.openxmlformats.org/drawingml/2006/main">
+              <a:graphicData uri="http://schemas.openxmlformats.org/drawingml/2006/picture">
+                <pic:pic xmlns:pic="http://schemas.openxmlformats.org/drawingml/2006/picture">
+                  <pic:nvPicPr>
+                    <pic:cNvPr id="1" name=""/>
+                    <pic:cNvPicPr/>
+                  </pic:nvPicPr>
+                  <pic:blipFill>
+                    <a:blip r:embed="rId16"/>
+                    <a:stretch>
+                      <a:fillRect/>
+                    </a:stretch>
+                  </pic:blipFill>
+                  <pic:spPr>
+                    <a:xfrm>
+                      <a:off x="0" y="0"/>
+                      <a:ext cx="3132801" cy="1192128"/>
+                    </a:xfrm>
+                    <a:prstGeom prst="rect">
+                      <a:avLst/>
+                    </a:prstGeom>
+                  </pic:spPr>
+                </pic:pic>
+              </a:graphicData>
+            </a:graphic>
+          </wp:inline>
+        </w:drawing>
+      </w:r>
+    </w:p>
+    <w:p>
       <w:bookmarkStart w:id="0" w:name="_GoBack"/>
       <w:bookmarkEnd w:id="0"/>
     </w:p>
     <w:p>
       <w:pPr>
-        <w:rPr>
-          <w:b/>
+        <w:jc w:val="center"/>
+        <w:rPr>
+          <w:b/>
+          <w:sz w:val="36"/>
+          <w:szCs w:val="36"/>
+          <w:lang w:val="es-ES"/>
+        </w:rPr>
+      </w:pPr>
+      <w:r>
+        <w:rPr>
+          <w:b/>
+          <w:sz w:val="36"/>
+          <w:szCs w:val="36"/>
+          <w:lang w:val="es-ES"/>
+        </w:rPr>
+        <w:t>CONSULTAS CON IA</w:t>
+      </w:r>
+    </w:p>
+    <w:p>
+      <w:pPr>
+        <w:rPr>
+          <w:b/>
+          <w:i/>
+          <w:lang w:val="es-ES"/>
+        </w:rPr>
+      </w:pPr>
+      <w:r>
+        <w:rPr>
+          <w:b/>
+          <w:i/>
+          <w:lang w:val="es-ES"/>
+        </w:rPr>
+        <w:t>Etapa 2: Generación de datos.</w:t>
+      </w:r>
+    </w:p>
+    <w:p>
+      <w:pPr>
+        <w:rPr>
+          <w:lang w:val="es-ES"/>
+        </w:rPr>
+      </w:pPr>
+      <w:r>
+        <w:rPr>
+          <w:lang w:val="es-ES"/>
+        </w:rPr>
+        <w:t xml:space="preserve">Se consultó dado que no fue posible la utilización de tabla semilla </w:t>
+      </w:r>
+      <w:r>
+        <w:rPr>
+          <w:lang w:val="es-ES"/>
+        </w:rPr>
+        <w:br/>
+      </w:r>
+    </w:p>
+    <w:p>
+      <w:pPr>
+        <w:rPr>
+          <w:lang w:val="es-ES"/>
+        </w:rPr>
+      </w:pPr>
+      <w:r>
+        <w:rPr>
+          <w:noProof/>
+        </w:rPr>
+        <w:drawing>
+          <wp:inline distT="0" distB="0" distL="0" distR="0" wp14:anchorId="7E37D256" wp14:editId="3953D30A">
+            <wp:extent cx="5612130" cy="2339975"/>
+            <wp:effectExtent l="0" t="0" r="7620" b="3175"/>
+            <wp:docPr id="10" name="Imagen 10"/>
+            <wp:cNvGraphicFramePr>
+              <a:graphicFrameLocks xmlns:a="http://schemas.openxmlformats.org/drawingml/2006/main" noChangeAspect="1"/>
+            </wp:cNvGraphicFramePr>
+            <a:graphic xmlns:a="http://schemas.openxmlformats.org/drawingml/2006/main">
+              <a:graphicData uri="http://schemas.openxmlformats.org/drawingml/2006/picture">
+                <pic:pic xmlns:pic="http://schemas.openxmlformats.org/drawingml/2006/picture">
+                  <pic:nvPicPr>
+                    <pic:cNvPr id="1" name=""/>
+                    <pic:cNvPicPr/>
+                  </pic:nvPicPr>
+                  <pic:blipFill>
+                    <a:blip r:embed="rId17"/>
+                    <a:stretch>
+                      <a:fillRect/>
+                    </a:stretch>
+                  </pic:blipFill>
+                  <pic:spPr>
+                    <a:xfrm>
+                      <a:off x="0" y="0"/>
+                      <a:ext cx="5612130" cy="2339975"/>
+                    </a:xfrm>
+                    <a:prstGeom prst="rect">
+                      <a:avLst/>
+                    </a:prstGeom>
+                  </pic:spPr>
+                </pic:pic>
+              </a:graphicData>
+            </a:graphic>
+          </wp:inline>
+        </w:drawing>
+      </w:r>
+    </w:p>
+    <w:p>
+      <w:pPr>
+        <w:rPr>
+          <w:lang w:val="es-ES"/>
+        </w:rPr>
+      </w:pPr>
+    </w:p>
+    <w:p>
+      <w:pPr>
+        <w:rPr>
+          <w:lang w:val="es-ES"/>
+        </w:rPr>
+      </w:pPr>
+      <w:r>
+        <w:rPr>
+          <w:noProof/>
+        </w:rPr>
+        <w:drawing>
+          <wp:inline distT="0" distB="0" distL="0" distR="0" wp14:anchorId="4CE8EC11" wp14:editId="35A62EF3">
+            <wp:extent cx="5612130" cy="1329690"/>
+            <wp:effectExtent l="0" t="0" r="7620" b="3810"/>
+            <wp:docPr id="11" name="Imagen 11"/>
+            <wp:cNvGraphicFramePr>
+              <a:graphicFrameLocks xmlns:a="http://schemas.openxmlformats.org/drawingml/2006/main" noChangeAspect="1"/>
+            </wp:cNvGraphicFramePr>
+            <a:graphic xmlns:a="http://schemas.openxmlformats.org/drawingml/2006/main">
+              <a:graphicData uri="http://schemas.openxmlformats.org/drawingml/2006/picture">
+                <pic:pic xmlns:pic="http://schemas.openxmlformats.org/drawingml/2006/picture">
+                  <pic:nvPicPr>
+                    <pic:cNvPr id="1" name=""/>
+                    <pic:cNvPicPr/>
+                  </pic:nvPicPr>
+                  <pic:blipFill>
+                    <a:blip r:embed="rId18"/>
+                    <a:stretch>
+                      <a:fillRect/>
+                    </a:stretch>
+                  </pic:blipFill>
+                  <pic:spPr>
+                    <a:xfrm>
+                      <a:off x="0" y="0"/>
+                      <a:ext cx="5612130" cy="1329690"/>
+                    </a:xfrm>
+                    <a:prstGeom prst="rect">
+                      <a:avLst/>
+                    </a:prstGeom>
+                  </pic:spPr>
+                </pic:pic>
+              </a:graphicData>
+            </a:graphic>
+          </wp:inline>
+        </w:drawing>
+      </w:r>
+    </w:p>
+    <w:p>
+      <w:pPr>
+        <w:rPr>
+          <w:lang w:val="es-ES"/>
+        </w:rPr>
+      </w:pPr>
+    </w:p>
+    <w:p>
+      <w:pPr>
+        <w:rPr>
+          <w:lang w:val="es-ES"/>
+        </w:rPr>
+      </w:pPr>
+      <w:r>
+        <w:rPr>
+          <w:noProof/>
+        </w:rPr>
+        <w:lastRenderedPageBreak/>
+        <w:drawing>
+          <wp:inline distT="0" distB="0" distL="0" distR="0" wp14:anchorId="055EBEFF" wp14:editId="1ED1E972">
+            <wp:extent cx="3028950" cy="1664243"/>
+            <wp:effectExtent l="0" t="0" r="0" b="0"/>
+            <wp:docPr id="21" name="Imagen 21"/>
+            <wp:cNvGraphicFramePr>
+              <a:graphicFrameLocks xmlns:a="http://schemas.openxmlformats.org/drawingml/2006/main" noChangeAspect="1"/>
+            </wp:cNvGraphicFramePr>
+            <a:graphic xmlns:a="http://schemas.openxmlformats.org/drawingml/2006/main">
+              <a:graphicData uri="http://schemas.openxmlformats.org/drawingml/2006/picture">
+                <pic:pic xmlns:pic="http://schemas.openxmlformats.org/drawingml/2006/picture">
+                  <pic:nvPicPr>
+                    <pic:cNvPr id="1" name=""/>
+                    <pic:cNvPicPr/>
+                  </pic:nvPicPr>
+                  <pic:blipFill>
+                    <a:blip r:embed="rId12"/>
+                    <a:stretch>
+                      <a:fillRect/>
+                    </a:stretch>
+                  </pic:blipFill>
+                  <pic:spPr>
+                    <a:xfrm>
+                      <a:off x="0" y="0"/>
+                      <a:ext cx="3033642" cy="1666821"/>
+                    </a:xfrm>
+                    <a:prstGeom prst="rect">
+                      <a:avLst/>
+                    </a:prstGeom>
+                  </pic:spPr>
+                </pic:pic>
+              </a:graphicData>
+            </a:graphic>
+          </wp:inline>
+        </w:drawing>
+      </w:r>
+    </w:p>
+    <w:p>
+      <w:pPr>
+        <w:pStyle w:val="NormalWeb"/>
+        <w:rPr>
+          <w:lang w:val="es-ES"/>
+        </w:rPr>
+      </w:pPr>
+      <w:r>
+        <w:rPr>
+          <w:lang w:val="es-ES"/>
+        </w:rPr>
+        <w:t xml:space="preserve">Este código genera los números del 0 al 9999 combinando </w:t>
+      </w:r>
+      <w:r>
+        <w:rPr>
+          <w:rStyle w:val="Textoennegrita"/>
+          <w:lang w:val="es-ES"/>
+        </w:rPr>
+        <w:t>cuatro bloques de dígitos</w:t>
+      </w:r>
+      <w:r>
+        <w:rPr>
+          <w:lang w:val="es-ES"/>
+        </w:rPr>
+        <w:t>:</w:t>
+      </w:r>
+    </w:p>
+    <w:p>
+      <w:pPr>
+        <w:pStyle w:val="NormalWeb"/>
+        <w:numPr>
+          <w:ilvl w:val="0"/>
+          <w:numId w:val="3"/>
+        </w:numPr>
+      </w:pPr>
+      <w:proofErr w:type="spellStart"/>
+      <w:r>
+        <w:rPr>
+          <w:rStyle w:val="CdigoHTML"/>
+        </w:rPr>
+        <w:t>a.m</w:t>
+      </w:r>
+      <w:proofErr w:type="spellEnd"/>
+      <w:r>
+        <w:t xml:space="preserve">: </w:t>
+      </w:r>
+      <w:proofErr w:type="spellStart"/>
+      <w:r>
+        <w:t>unidades</w:t>
+      </w:r>
+      <w:proofErr w:type="spellEnd"/>
+      <w:r>
+        <w:t xml:space="preserve"> (0 a 9)</w:t>
+      </w:r>
+    </w:p>
+    <w:p>
+      <w:pPr>
+        <w:pStyle w:val="NormalWeb"/>
+        <w:numPr>
+          <w:ilvl w:val="0"/>
+          <w:numId w:val="3"/>
+        </w:numPr>
+      </w:pPr>
+      <w:proofErr w:type="spellStart"/>
+      <w:r>
+        <w:rPr>
+          <w:rStyle w:val="CdigoHTML"/>
+        </w:rPr>
+        <w:t>b.n</w:t>
+      </w:r>
+      <w:proofErr w:type="spellEnd"/>
+      <w:r>
+        <w:t xml:space="preserve">: </w:t>
+      </w:r>
+      <w:proofErr w:type="spellStart"/>
+      <w:r>
+        <w:t>decenas</w:t>
+      </w:r>
+      <w:proofErr w:type="spellEnd"/>
+      <w:r>
+        <w:t xml:space="preserve"> (0 a 9)</w:t>
+      </w:r>
+    </w:p>
+    <w:p>
+      <w:pPr>
+        <w:pStyle w:val="NormalWeb"/>
+        <w:numPr>
+          <w:ilvl w:val="0"/>
+          <w:numId w:val="3"/>
+        </w:numPr>
+      </w:pPr>
+      <w:proofErr w:type="spellStart"/>
+      <w:r>
+        <w:rPr>
+          <w:rStyle w:val="CdigoHTML"/>
+        </w:rPr>
+        <w:t>c.n</w:t>
+      </w:r>
+      <w:proofErr w:type="spellEnd"/>
+      <w:r>
+        <w:rPr>
+          <w:rStyle w:val="CdigoHTML"/>
+        </w:rPr>
+        <w:t xml:space="preserve"> * 100</w:t>
+      </w:r>
+      <w:r>
+        <w:t xml:space="preserve">: </w:t>
+      </w:r>
+      <w:proofErr w:type="spellStart"/>
+      <w:r>
+        <w:t>centenas</w:t>
+      </w:r>
+      <w:proofErr w:type="spellEnd"/>
+      <w:r>
+        <w:t xml:space="preserve"> (0 a 900)</w:t>
+      </w:r>
+    </w:p>
+    <w:p>
+      <w:pPr>
+        <w:pStyle w:val="NormalWeb"/>
+        <w:numPr>
+          <w:ilvl w:val="0"/>
+          <w:numId w:val="3"/>
+        </w:numPr>
+      </w:pPr>
+      <w:proofErr w:type="spellStart"/>
+      <w:r>
+        <w:rPr>
+          <w:rStyle w:val="CdigoHTML"/>
+        </w:rPr>
+        <w:t>d.n</w:t>
+      </w:r>
+      <w:proofErr w:type="spellEnd"/>
+      <w:r>
+        <w:rPr>
+          <w:rStyle w:val="CdigoHTML"/>
+        </w:rPr>
+        <w:t xml:space="preserve"> * 1000</w:t>
+      </w:r>
+      <w:r>
+        <w:t xml:space="preserve">: </w:t>
+      </w:r>
+      <w:proofErr w:type="spellStart"/>
+      <w:r>
+        <w:t>millares</w:t>
+      </w:r>
+      <w:proofErr w:type="spellEnd"/>
+      <w:r>
+        <w:t xml:space="preserve"> (0 a 9000)</w:t>
+      </w:r>
+    </w:p>
+    <w:p>
+      <w:pPr>
+        <w:pStyle w:val="NormalWeb"/>
+        <w:rPr>
+          <w:lang w:val="es-ES"/>
+        </w:rPr>
+      </w:pPr>
+      <w:r>
+        <w:rPr>
+          <w:lang w:val="es-ES"/>
+        </w:rPr>
+        <w:t xml:space="preserve">Cada </w:t>
+      </w:r>
+      <w:proofErr w:type="spellStart"/>
+      <w:r>
+        <w:rPr>
+          <w:lang w:val="es-ES"/>
+        </w:rPr>
+        <w:t>subconsulta</w:t>
+      </w:r>
+      <w:proofErr w:type="spellEnd"/>
+      <w:r>
+        <w:rPr>
+          <w:lang w:val="es-ES"/>
+        </w:rPr>
+        <w:t xml:space="preserve"> como </w:t>
+      </w:r>
+      <w:r>
+        <w:rPr>
+          <w:rStyle w:val="CdigoHTML"/>
+          <w:lang w:val="es-ES"/>
+        </w:rPr>
+        <w:t xml:space="preserve">(SELECT 0 UNION ALL SELECT 1, </w:t>
+      </w:r>
+      <w:r>
+        <w:rPr>
+          <w:rStyle w:val="CdigoHTML"/>
+          <w:lang w:val="es-ES"/>
+        </w:rPr>
+        <w:t>SELECT 9)</w:t>
+      </w:r>
+      <w:r>
+        <w:rPr>
+          <w:lang w:val="es-ES"/>
+        </w:rPr>
+        <w:t xml:space="preserve"> genera una tabla virtual con los dígitos del 0 al 9. Al hacer un </w:t>
+      </w:r>
+      <w:r>
+        <w:rPr>
+          <w:rStyle w:val="Textoennegrita"/>
+          <w:lang w:val="es-ES"/>
+        </w:rPr>
+        <w:t>producto cartesiano</w:t>
+      </w:r>
+      <w:r>
+        <w:rPr>
+          <w:lang w:val="es-ES"/>
+        </w:rPr>
+        <w:t xml:space="preserve"> entre las cuatro, se obtienen todas las combinaciones posibles de 4 dígitos:</w:t>
+      </w:r>
+    </w:p>
+    <w:p>
+      <w:pPr>
+        <w:pStyle w:val="NormalWeb"/>
+        <w:rPr>
+          <w:lang w:val="es-ES"/>
+        </w:rPr>
+      </w:pPr>
+      <w:r>
+        <w:rPr>
+          <w:lang w:val="es-ES"/>
+        </w:rPr>
+        <w:t xml:space="preserve">El </w:t>
+      </w:r>
+      <w:r>
+        <w:rPr>
+          <w:rStyle w:val="CdigoHTML"/>
+          <w:lang w:val="es-ES"/>
+        </w:rPr>
+        <w:t>WHERE</w:t>
+      </w:r>
+      <w:r>
+        <w:rPr>
+          <w:lang w:val="es-ES"/>
+        </w:rPr>
+        <w:t xml:space="preserve"> asegura que el resultado esté entre 0 y 9999.</w:t>
+      </w:r>
+    </w:p>
+    <w:p>
+      <w:pPr>
+        <w:rPr>
+          <w:lang w:val="es-ES"/>
+        </w:rPr>
+      </w:pPr>
+      <w:r>
+        <w:rPr>
+          <w:noProof/>
+        </w:rPr>
+        <w:drawing>
+          <wp:inline distT="0" distB="0" distL="0" distR="0" wp14:anchorId="6B459FA5" wp14:editId="6E2C4D31">
+            <wp:extent cx="5612130" cy="2268220"/>
+            <wp:effectExtent l="0" t="0" r="7620" b="0"/>
+            <wp:docPr id="17" name="Imagen 17"/>
+            <wp:cNvGraphicFramePr>
+              <a:graphicFrameLocks xmlns:a="http://schemas.openxmlformats.org/drawingml/2006/main" noChangeAspect="1"/>
+            </wp:cNvGraphicFramePr>
+            <a:graphic xmlns:a="http://schemas.openxmlformats.org/drawingml/2006/main">
+              <a:graphicData uri="http://schemas.openxmlformats.org/drawingml/2006/picture">
+                <pic:pic xmlns:pic="http://schemas.openxmlformats.org/drawingml/2006/picture">
+                  <pic:nvPicPr>
+                    <pic:cNvPr id="1" name=""/>
+                    <pic:cNvPicPr/>
+                  </pic:nvPicPr>
+                  <pic:blipFill>
+                    <a:blip r:embed="rId19"/>
+                    <a:stretch>
+                      <a:fillRect/>
+                    </a:stretch>
+                  </pic:blipFill>
+                  <pic:spPr>
+                    <a:xfrm>
+                      <a:off x="0" y="0"/>
+                      <a:ext cx="5612130" cy="2268220"/>
+                    </a:xfrm>
+                    <a:prstGeom prst="rect">
+                      <a:avLst/>
+                    </a:prstGeom>
+                  </pic:spPr>
+                </pic:pic>
+              </a:graphicData>
+            </a:graphic>
+          </wp:inline>
+        </w:drawing>
+      </w:r>
+    </w:p>
+    <w:p>
+      <w:pPr>
+        <w:rPr>
+          <w:lang w:val="es-ES"/>
+        </w:rPr>
+      </w:pPr>
+    </w:p>
+    <w:p>
+      <w:pPr>
+        <w:rPr>
+          <w:lang w:val="es-ES"/>
+        </w:rPr>
+      </w:pPr>
+      <w:r>
+        <w:rPr>
+          <w:noProof/>
+        </w:rPr>
+        <w:lastRenderedPageBreak/>
+        <w:drawing>
+          <wp:inline distT="0" distB="0" distL="0" distR="0" wp14:anchorId="4FA17A97" wp14:editId="6431D771">
+            <wp:extent cx="5612130" cy="2274570"/>
+            <wp:effectExtent l="0" t="0" r="7620" b="0"/>
+            <wp:docPr id="18" name="Imagen 18"/>
+            <wp:cNvGraphicFramePr>
+              <a:graphicFrameLocks xmlns:a="http://schemas.openxmlformats.org/drawingml/2006/main" noChangeAspect="1"/>
+            </wp:cNvGraphicFramePr>
+            <a:graphic xmlns:a="http://schemas.openxmlformats.org/drawingml/2006/main">
+              <a:graphicData uri="http://schemas.openxmlformats.org/drawingml/2006/picture">
+                <pic:pic xmlns:pic="http://schemas.openxmlformats.org/drawingml/2006/picture">
+                  <pic:nvPicPr>
+                    <pic:cNvPr id="1" name=""/>
+                    <pic:cNvPicPr/>
+                  </pic:nvPicPr>
+                  <pic:blipFill>
+                    <a:blip r:embed="rId20"/>
+                    <a:stretch>
+                      <a:fillRect/>
+                    </a:stretch>
+                  </pic:blipFill>
+                  <pic:spPr>
+                    <a:xfrm>
+                      <a:off x="0" y="0"/>
+                      <a:ext cx="5612130" cy="2274570"/>
+                    </a:xfrm>
+                    <a:prstGeom prst="rect">
+                      <a:avLst/>
+                    </a:prstGeom>
+                  </pic:spPr>
+                </pic:pic>
+              </a:graphicData>
+            </a:graphic>
+          </wp:inline>
+        </w:drawing>
+      </w:r>
+    </w:p>
+    <w:p>
+      <w:pPr>
+        <w:rPr>
+          <w:lang w:val="es-ES"/>
+        </w:rPr>
+      </w:pPr>
+      <w:r>
+        <w:rPr>
+          <w:noProof/>
+        </w:rPr>
+        <w:drawing>
+          <wp:inline distT="0" distB="0" distL="0" distR="0" wp14:anchorId="0F88CD79" wp14:editId="054F8D94">
+            <wp:extent cx="5612130" cy="1753870"/>
+            <wp:effectExtent l="0" t="0" r="7620" b="0"/>
+            <wp:docPr id="19" name="Imagen 19"/>
+            <wp:cNvGraphicFramePr>
+              <a:graphicFrameLocks xmlns:a="http://schemas.openxmlformats.org/drawingml/2006/main" noChangeAspect="1"/>
+            </wp:cNvGraphicFramePr>
+            <a:graphic xmlns:a="http://schemas.openxmlformats.org/drawingml/2006/main">
+              <a:graphicData uri="http://schemas.openxmlformats.org/drawingml/2006/picture">
+                <pic:pic xmlns:pic="http://schemas.openxmlformats.org/drawingml/2006/picture">
+                  <pic:nvPicPr>
+                    <pic:cNvPr id="1" name=""/>
+                    <pic:cNvPicPr/>
+                  </pic:nvPicPr>
+                  <pic:blipFill>
+                    <a:blip r:embed="rId21"/>
+                    <a:stretch>
+                      <a:fillRect/>
+                    </a:stretch>
+                  </pic:blipFill>
+                  <pic:spPr>
+                    <a:xfrm>
+                      <a:off x="0" y="0"/>
+                      <a:ext cx="5612130" cy="1753870"/>
+                    </a:xfrm>
+                    <a:prstGeom prst="rect">
+                      <a:avLst/>
+                    </a:prstGeom>
+                  </pic:spPr>
+                </pic:pic>
+              </a:graphicData>
+            </a:graphic>
+          </wp:inline>
+        </w:drawing>
+      </w:r>
+    </w:p>
+    <w:p>
+      <w:pPr>
+        <w:rPr>
+          <w:lang w:val="es-ES"/>
+        </w:rPr>
+      </w:pPr>
+    </w:p>
+    <w:p>
+      <w:pPr>
+        <w:rPr>
+          <w:lang w:val="es-ES"/>
+        </w:rPr>
+      </w:pPr>
+      <w:r>
+        <w:rPr>
+          <w:noProof/>
+        </w:rPr>
+        <w:drawing>
+          <wp:inline distT="0" distB="0" distL="0" distR="0" wp14:anchorId="068C94E6" wp14:editId="2B24BA30">
+            <wp:extent cx="5612130" cy="1670685"/>
+            <wp:effectExtent l="0" t="0" r="7620" b="5715"/>
+            <wp:docPr id="20" name="Imagen 20"/>
+            <wp:cNvGraphicFramePr>
+              <a:graphicFrameLocks xmlns:a="http://schemas.openxmlformats.org/drawingml/2006/main" noChangeAspect="1"/>
+            </wp:cNvGraphicFramePr>
+            <a:graphic xmlns:a="http://schemas.openxmlformats.org/drawingml/2006/main">
+              <a:graphicData uri="http://schemas.openxmlformats.org/drawingml/2006/picture">
+                <pic:pic xmlns:pic="http://schemas.openxmlformats.org/drawingml/2006/picture">
+                  <pic:nvPicPr>
+                    <pic:cNvPr id="1" name=""/>
+                    <pic:cNvPicPr/>
+                  </pic:nvPicPr>
+                  <pic:blipFill>
+                    <a:blip r:embed="rId22"/>
+                    <a:stretch>
+                      <a:fillRect/>
+                    </a:stretch>
+                  </pic:blipFill>
+                  <pic:spPr>
+                    <a:xfrm>
+                      <a:off x="0" y="0"/>
+                      <a:ext cx="5612130" cy="1670685"/>
+                    </a:xfrm>
+                    <a:prstGeom prst="rect">
+                      <a:avLst/>
+                    </a:prstGeom>
+                  </pic:spPr>
+                </pic:pic>
+              </a:graphicData>
+            </a:graphic>
+          </wp:inline>
+        </w:drawing>
+      </w:r>
+    </w:p>
+    <w:p>
+      <w:pPr>
+        <w:rPr>
+          <w:lang w:val="es-ES"/>
+        </w:rPr>
+      </w:pPr>
+    </w:p>
+    <w:p>
+      <w:pPr>
+        <w:rPr>
+          <w:lang w:val="es-ES"/>
+        </w:rPr>
+      </w:pPr>
+      <w:r>
+        <w:rPr>
+          <w:noProof/>
+        </w:rPr>
+        <w:drawing>
+          <wp:inline distT="0" distB="0" distL="0" distR="0" wp14:anchorId="01D52FB6" wp14:editId="4E67B61C">
+            <wp:extent cx="5612130" cy="1099185"/>
+            <wp:effectExtent l="0" t="0" r="7620" b="5715"/>
+            <wp:docPr id="22" name="Imagen 22"/>
+            <wp:cNvGraphicFramePr>
+              <a:graphicFrameLocks xmlns:a="http://schemas.openxmlformats.org/drawingml/2006/main" noChangeAspect="1"/>
+            </wp:cNvGraphicFramePr>
+            <a:graphic xmlns:a="http://schemas.openxmlformats.org/drawingml/2006/main">
+              <a:graphicData uri="http://schemas.openxmlformats.org/drawingml/2006/picture">
+                <pic:pic xmlns:pic="http://schemas.openxmlformats.org/drawingml/2006/picture">
+                  <pic:nvPicPr>
+                    <pic:cNvPr id="1" name=""/>
+                    <pic:cNvPicPr/>
+                  </pic:nvPicPr>
+                  <pic:blipFill>
+                    <a:blip r:embed="rId23"/>
+                    <a:stretch>
+                      <a:fillRect/>
+                    </a:stretch>
+                  </pic:blipFill>
+                  <pic:spPr>
+                    <a:xfrm>
+                      <a:off x="0" y="0"/>
+                      <a:ext cx="5612130" cy="1099185"/>
+                    </a:xfrm>
+                    <a:prstGeom prst="rect">
+                      <a:avLst/>
+                    </a:prstGeom>
+                  </pic:spPr>
+                </pic:pic>
+              </a:graphicData>
+            </a:graphic>
+          </wp:inline>
+        </w:drawing>
+      </w:r>
+    </w:p>
+    <w:p>
+      <w:pPr>
+        <w:rPr>
+          <w:lang w:val="es-ES"/>
+        </w:rPr>
+      </w:pPr>
+    </w:p>
+    <w:p>
+      <w:pPr>
+        <w:rPr>
+          <w:lang w:val="es-ES"/>
+        </w:rPr>
+      </w:pPr>
+    </w:p>
+    <w:p>
+      <w:pPr>
+        <w:rPr>
+          <w:lang w:val="es-ES"/>
+        </w:rPr>
+      </w:pPr>
+    </w:p>
+    <w:p>
+      <w:pPr>
+        <w:rPr>
+          <w:lang w:val="es-ES"/>
+        </w:rPr>
+      </w:pPr>
+    </w:p>
+    <w:p>
+      <w:pPr>
+        <w:rPr>
+          <w:lang w:val="es-ES"/>
+        </w:rPr>
+      </w:pPr>
+    </w:p>
+    <w:p>
+      <w:pPr>
+        <w:rPr>
+          <w:lang w:val="es-ES"/>
+        </w:rPr>
+      </w:pPr>
+    </w:p>
+    <w:p>
+      <w:pPr>
+        <w:rPr>
+          <w:lang w:val="es-ES"/>
+        </w:rPr>
+      </w:pPr>
+    </w:p>
+    <w:p>
+      <w:pPr>
+        <w:rPr>
+          <w:lang w:val="es-ES"/>
+        </w:rPr>
+      </w:pPr>
+    </w:p>
+    <w:p>
+      <w:pPr>
+        <w:rPr>
+          <w:lang w:val="es-ES"/>
+        </w:rPr>
+      </w:pPr>
+    </w:p>
+    <w:p>
+      <w:pPr>
+        <w:rPr>
+          <w:lang w:val="es-ES"/>
+        </w:rPr>
+      </w:pPr>
+    </w:p>
+    <w:p>
+      <w:pPr>
+        <w:rPr>
+          <w:lang w:val="es-ES"/>
+        </w:rPr>
+      </w:pPr>
+    </w:p>
+    <w:p>
+      <w:pPr>
+        <w:rPr>
           <w:lang w:val="es-ES"/>
         </w:rPr>
       </w:pPr>
@@ -1782,6 +4510,896 @@
     </w:sectPr>
   </w:body>
 </w:document>
+</file>
+
+<file path=word/numbering.xml><?xml version="1.0" encoding="utf-8"?>
+<w:numbering xmlns:wpc="http://schemas.microsoft.com/office/word/2010/wordprocessingCanvas" xmlns:cx="http://schemas.microsoft.com/office/drawing/2014/chartex" xmlns:cx1="http://schemas.microsoft.com/office/drawing/2015/9/8/chartex" xmlns:mc="http://schemas.openxmlformats.org/markup-compatibility/2006" xmlns:o="urn:schemas-microsoft-com:office:office" xmlns:r="http://schemas.openxmlformats.org/officeDocument/2006/relationships" xmlns:m="http://schemas.openxmlformats.org/officeDocument/2006/math" xmlns:v="urn:schemas-microsoft-com:vml" xmlns:wp14="http://schemas.microsoft.com/office/word/2010/wordprocessingDrawing" xmlns:wp="http://schemas.openxmlformats.org/drawingml/2006/wordprocessingDrawing" xmlns:w10="urn:schemas-microsoft-com:office:word" xmlns:w="http://schemas.openxmlformats.org/wordprocessingml/2006/main" xmlns:w14="http://schemas.microsoft.com/office/word/2010/wordml" xmlns:w15="http://schemas.microsoft.com/office/word/2012/wordml" xmlns:w16se="http://schemas.microsoft.com/office/word/2015/wordml/symex" xmlns:wpg="http://schemas.microsoft.com/office/word/2010/wordprocessingGroup" xmlns:wpi="http://schemas.microsoft.com/office/word/2010/wordprocessingInk" xmlns:wne="http://schemas.microsoft.com/office/word/2006/wordml" xmlns:wps="http://schemas.microsoft.com/office/word/2010/wordprocessingShape" mc:Ignorable="w14 w15 w16se wp14">
+  <w:abstractNum w:abstractNumId="0" w15:restartNumberingAfterBreak="0">
+    <w:nsid w:val="07FA1F76"/>
+    <w:multiLevelType w:val="multilevel"/>
+    <w:tmpl w:val="3446E8B4"/>
+    <w:lvl w:ilvl="0">
+      <w:start w:val="1"/>
+      <w:numFmt w:val="bullet"/>
+      <w:lvlText w:val=""/>
+      <w:lvlJc w:val="left"/>
+      <w:pPr>
+        <w:tabs>
+          <w:tab w:val="num" w:pos="720"/>
+        </w:tabs>
+        <w:ind w:left="720" w:hanging="360"/>
+      </w:pPr>
+      <w:rPr>
+        <w:rFonts w:ascii="Symbol" w:hAnsi="Symbol" w:hint="default"/>
+        <w:sz w:val="20"/>
+      </w:rPr>
+    </w:lvl>
+    <w:lvl w:ilvl="1" w:tentative="1">
+      <w:start w:val="1"/>
+      <w:numFmt w:val="bullet"/>
+      <w:lvlText w:val="o"/>
+      <w:lvlJc w:val="left"/>
+      <w:pPr>
+        <w:tabs>
+          <w:tab w:val="num" w:pos="1440"/>
+        </w:tabs>
+        <w:ind w:left="1440" w:hanging="360"/>
+      </w:pPr>
+      <w:rPr>
+        <w:rFonts w:ascii="Courier New" w:hAnsi="Courier New" w:hint="default"/>
+        <w:sz w:val="20"/>
+      </w:rPr>
+    </w:lvl>
+    <w:lvl w:ilvl="2" w:tentative="1">
+      <w:start w:val="1"/>
+      <w:numFmt w:val="bullet"/>
+      <w:lvlText w:val=""/>
+      <w:lvlJc w:val="left"/>
+      <w:pPr>
+        <w:tabs>
+          <w:tab w:val="num" w:pos="2160"/>
+        </w:tabs>
+        <w:ind w:left="2160" w:hanging="360"/>
+      </w:pPr>
+      <w:rPr>
+        <w:rFonts w:ascii="Wingdings" w:hAnsi="Wingdings" w:hint="default"/>
+        <w:sz w:val="20"/>
+      </w:rPr>
+    </w:lvl>
+    <w:lvl w:ilvl="3" w:tentative="1">
+      <w:start w:val="1"/>
+      <w:numFmt w:val="bullet"/>
+      <w:lvlText w:val=""/>
+      <w:lvlJc w:val="left"/>
+      <w:pPr>
+        <w:tabs>
+          <w:tab w:val="num" w:pos="2880"/>
+        </w:tabs>
+        <w:ind w:left="2880" w:hanging="360"/>
+      </w:pPr>
+      <w:rPr>
+        <w:rFonts w:ascii="Wingdings" w:hAnsi="Wingdings" w:hint="default"/>
+        <w:sz w:val="20"/>
+      </w:rPr>
+    </w:lvl>
+    <w:lvl w:ilvl="4" w:tentative="1">
+      <w:start w:val="1"/>
+      <w:numFmt w:val="bullet"/>
+      <w:lvlText w:val=""/>
+      <w:lvlJc w:val="left"/>
+      <w:pPr>
+        <w:tabs>
+          <w:tab w:val="num" w:pos="3600"/>
+        </w:tabs>
+        <w:ind w:left="3600" w:hanging="360"/>
+      </w:pPr>
+      <w:rPr>
+        <w:rFonts w:ascii="Wingdings" w:hAnsi="Wingdings" w:hint="default"/>
+        <w:sz w:val="20"/>
+      </w:rPr>
+    </w:lvl>
+    <w:lvl w:ilvl="5" w:tentative="1">
+      <w:start w:val="1"/>
+      <w:numFmt w:val="bullet"/>
+      <w:lvlText w:val=""/>
+      <w:lvlJc w:val="left"/>
+      <w:pPr>
+        <w:tabs>
+          <w:tab w:val="num" w:pos="4320"/>
+        </w:tabs>
+        <w:ind w:left="4320" w:hanging="360"/>
+      </w:pPr>
+      <w:rPr>
+        <w:rFonts w:ascii="Wingdings" w:hAnsi="Wingdings" w:hint="default"/>
+        <w:sz w:val="20"/>
+      </w:rPr>
+    </w:lvl>
+    <w:lvl w:ilvl="6" w:tentative="1">
+      <w:start w:val="1"/>
+      <w:numFmt w:val="bullet"/>
+      <w:lvlText w:val=""/>
+      <w:lvlJc w:val="left"/>
+      <w:pPr>
+        <w:tabs>
+          <w:tab w:val="num" w:pos="5040"/>
+        </w:tabs>
+        <w:ind w:left="5040" w:hanging="360"/>
+      </w:pPr>
+      <w:rPr>
+        <w:rFonts w:ascii="Wingdings" w:hAnsi="Wingdings" w:hint="default"/>
+        <w:sz w:val="20"/>
+      </w:rPr>
+    </w:lvl>
+    <w:lvl w:ilvl="7" w:tentative="1">
+      <w:start w:val="1"/>
+      <w:numFmt w:val="bullet"/>
+      <w:lvlText w:val=""/>
+      <w:lvlJc w:val="left"/>
+      <w:pPr>
+        <w:tabs>
+          <w:tab w:val="num" w:pos="5760"/>
+        </w:tabs>
+        <w:ind w:left="5760" w:hanging="360"/>
+      </w:pPr>
+      <w:rPr>
+        <w:rFonts w:ascii="Wingdings" w:hAnsi="Wingdings" w:hint="default"/>
+        <w:sz w:val="20"/>
+      </w:rPr>
+    </w:lvl>
+    <w:lvl w:ilvl="8" w:tentative="1">
+      <w:start w:val="1"/>
+      <w:numFmt w:val="bullet"/>
+      <w:lvlText w:val=""/>
+      <w:lvlJc w:val="left"/>
+      <w:pPr>
+        <w:tabs>
+          <w:tab w:val="num" w:pos="6480"/>
+        </w:tabs>
+        <w:ind w:left="6480" w:hanging="360"/>
+      </w:pPr>
+      <w:rPr>
+        <w:rFonts w:ascii="Wingdings" w:hAnsi="Wingdings" w:hint="default"/>
+        <w:sz w:val="20"/>
+      </w:rPr>
+    </w:lvl>
+  </w:abstractNum>
+  <w:abstractNum w:abstractNumId="1" w15:restartNumberingAfterBreak="0">
+    <w:nsid w:val="0EAF76B4"/>
+    <w:multiLevelType w:val="hybridMultilevel"/>
+    <w:tmpl w:val="A8C064FE"/>
+    <w:lvl w:ilvl="0" w:tplc="EE086AEC">
+      <w:start w:val="5"/>
+      <w:numFmt w:val="bullet"/>
+      <w:lvlText w:val="-"/>
+      <w:lvlJc w:val="left"/>
+      <w:pPr>
+        <w:ind w:left="720" w:hanging="360"/>
+      </w:pPr>
+      <w:rPr>
+        <w:rFonts w:ascii="Calibri" w:eastAsiaTheme="minorHAnsi" w:hAnsi="Calibri" w:cs="Calibri" w:hint="default"/>
+        <w:b w:val="0"/>
+      </w:rPr>
+    </w:lvl>
+    <w:lvl w:ilvl="1" w:tplc="04090003" w:tentative="1">
+      <w:start w:val="1"/>
+      <w:numFmt w:val="bullet"/>
+      <w:lvlText w:val="o"/>
+      <w:lvlJc w:val="left"/>
+      <w:pPr>
+        <w:ind w:left="1440" w:hanging="360"/>
+      </w:pPr>
+      <w:rPr>
+        <w:rFonts w:ascii="Courier New" w:hAnsi="Courier New" w:cs="Courier New" w:hint="default"/>
+      </w:rPr>
+    </w:lvl>
+    <w:lvl w:ilvl="2" w:tplc="04090005" w:tentative="1">
+      <w:start w:val="1"/>
+      <w:numFmt w:val="bullet"/>
+      <w:lvlText w:val=""/>
+      <w:lvlJc w:val="left"/>
+      <w:pPr>
+        <w:ind w:left="2160" w:hanging="360"/>
+      </w:pPr>
+      <w:rPr>
+        <w:rFonts w:ascii="Wingdings" w:hAnsi="Wingdings" w:hint="default"/>
+      </w:rPr>
+    </w:lvl>
+    <w:lvl w:ilvl="3" w:tplc="04090001" w:tentative="1">
+      <w:start w:val="1"/>
+      <w:numFmt w:val="bullet"/>
+      <w:lvlText w:val=""/>
+      <w:lvlJc w:val="left"/>
+      <w:pPr>
+        <w:ind w:left="2880" w:hanging="360"/>
+      </w:pPr>
+      <w:rPr>
+        <w:rFonts w:ascii="Symbol" w:hAnsi="Symbol" w:hint="default"/>
+      </w:rPr>
+    </w:lvl>
+    <w:lvl w:ilvl="4" w:tplc="04090003" w:tentative="1">
+      <w:start w:val="1"/>
+      <w:numFmt w:val="bullet"/>
+      <w:lvlText w:val="o"/>
+      <w:lvlJc w:val="left"/>
+      <w:pPr>
+        <w:ind w:left="3600" w:hanging="360"/>
+      </w:pPr>
+      <w:rPr>
+        <w:rFonts w:ascii="Courier New" w:hAnsi="Courier New" w:cs="Courier New" w:hint="default"/>
+      </w:rPr>
+    </w:lvl>
+    <w:lvl w:ilvl="5" w:tplc="04090005" w:tentative="1">
+      <w:start w:val="1"/>
+      <w:numFmt w:val="bullet"/>
+      <w:lvlText w:val=""/>
+      <w:lvlJc w:val="left"/>
+      <w:pPr>
+        <w:ind w:left="4320" w:hanging="360"/>
+      </w:pPr>
+      <w:rPr>
+        <w:rFonts w:ascii="Wingdings" w:hAnsi="Wingdings" w:hint="default"/>
+      </w:rPr>
+    </w:lvl>
+    <w:lvl w:ilvl="6" w:tplc="04090001" w:tentative="1">
+      <w:start w:val="1"/>
+      <w:numFmt w:val="bullet"/>
+      <w:lvlText w:val=""/>
+      <w:lvlJc w:val="left"/>
+      <w:pPr>
+        <w:ind w:left="5040" w:hanging="360"/>
+      </w:pPr>
+      <w:rPr>
+        <w:rFonts w:ascii="Symbol" w:hAnsi="Symbol" w:hint="default"/>
+      </w:rPr>
+    </w:lvl>
+    <w:lvl w:ilvl="7" w:tplc="04090003" w:tentative="1">
+      <w:start w:val="1"/>
+      <w:numFmt w:val="bullet"/>
+      <w:lvlText w:val="o"/>
+      <w:lvlJc w:val="left"/>
+      <w:pPr>
+        <w:ind w:left="5760" w:hanging="360"/>
+      </w:pPr>
+      <w:rPr>
+        <w:rFonts w:ascii="Courier New" w:hAnsi="Courier New" w:cs="Courier New" w:hint="default"/>
+      </w:rPr>
+    </w:lvl>
+    <w:lvl w:ilvl="8" w:tplc="04090005" w:tentative="1">
+      <w:start w:val="1"/>
+      <w:numFmt w:val="bullet"/>
+      <w:lvlText w:val=""/>
+      <w:lvlJc w:val="left"/>
+      <w:pPr>
+        <w:ind w:left="6480" w:hanging="360"/>
+      </w:pPr>
+      <w:rPr>
+        <w:rFonts w:ascii="Wingdings" w:hAnsi="Wingdings" w:hint="default"/>
+      </w:rPr>
+    </w:lvl>
+  </w:abstractNum>
+  <w:abstractNum w:abstractNumId="2" w15:restartNumberingAfterBreak="0">
+    <w:nsid w:val="12964202"/>
+    <w:multiLevelType w:val="multilevel"/>
+    <w:tmpl w:val="2324A8EE"/>
+    <w:lvl w:ilvl="0">
+      <w:start w:val="1"/>
+      <w:numFmt w:val="bullet"/>
+      <w:lvlText w:val=""/>
+      <w:lvlJc w:val="left"/>
+      <w:pPr>
+        <w:tabs>
+          <w:tab w:val="num" w:pos="720"/>
+        </w:tabs>
+        <w:ind w:left="720" w:hanging="360"/>
+      </w:pPr>
+      <w:rPr>
+        <w:rFonts w:ascii="Symbol" w:hAnsi="Symbol" w:hint="default"/>
+        <w:sz w:val="20"/>
+      </w:rPr>
+    </w:lvl>
+    <w:lvl w:ilvl="1" w:tentative="1">
+      <w:start w:val="1"/>
+      <w:numFmt w:val="bullet"/>
+      <w:lvlText w:val="o"/>
+      <w:lvlJc w:val="left"/>
+      <w:pPr>
+        <w:tabs>
+          <w:tab w:val="num" w:pos="1440"/>
+        </w:tabs>
+        <w:ind w:left="1440" w:hanging="360"/>
+      </w:pPr>
+      <w:rPr>
+        <w:rFonts w:ascii="Courier New" w:hAnsi="Courier New" w:hint="default"/>
+        <w:sz w:val="20"/>
+      </w:rPr>
+    </w:lvl>
+    <w:lvl w:ilvl="2" w:tentative="1">
+      <w:start w:val="1"/>
+      <w:numFmt w:val="bullet"/>
+      <w:lvlText w:val=""/>
+      <w:lvlJc w:val="left"/>
+      <w:pPr>
+        <w:tabs>
+          <w:tab w:val="num" w:pos="2160"/>
+        </w:tabs>
+        <w:ind w:left="2160" w:hanging="360"/>
+      </w:pPr>
+      <w:rPr>
+        <w:rFonts w:ascii="Wingdings" w:hAnsi="Wingdings" w:hint="default"/>
+        <w:sz w:val="20"/>
+      </w:rPr>
+    </w:lvl>
+    <w:lvl w:ilvl="3" w:tentative="1">
+      <w:start w:val="1"/>
+      <w:numFmt w:val="bullet"/>
+      <w:lvlText w:val=""/>
+      <w:lvlJc w:val="left"/>
+      <w:pPr>
+        <w:tabs>
+          <w:tab w:val="num" w:pos="2880"/>
+        </w:tabs>
+        <w:ind w:left="2880" w:hanging="360"/>
+      </w:pPr>
+      <w:rPr>
+        <w:rFonts w:ascii="Wingdings" w:hAnsi="Wingdings" w:hint="default"/>
+        <w:sz w:val="20"/>
+      </w:rPr>
+    </w:lvl>
+    <w:lvl w:ilvl="4" w:tentative="1">
+      <w:start w:val="1"/>
+      <w:numFmt w:val="bullet"/>
+      <w:lvlText w:val=""/>
+      <w:lvlJc w:val="left"/>
+      <w:pPr>
+        <w:tabs>
+          <w:tab w:val="num" w:pos="3600"/>
+        </w:tabs>
+        <w:ind w:left="3600" w:hanging="360"/>
+      </w:pPr>
+      <w:rPr>
+        <w:rFonts w:ascii="Wingdings" w:hAnsi="Wingdings" w:hint="default"/>
+        <w:sz w:val="20"/>
+      </w:rPr>
+    </w:lvl>
+    <w:lvl w:ilvl="5" w:tentative="1">
+      <w:start w:val="1"/>
+      <w:numFmt w:val="bullet"/>
+      <w:lvlText w:val=""/>
+      <w:lvlJc w:val="left"/>
+      <w:pPr>
+        <w:tabs>
+          <w:tab w:val="num" w:pos="4320"/>
+        </w:tabs>
+        <w:ind w:left="4320" w:hanging="360"/>
+      </w:pPr>
+      <w:rPr>
+        <w:rFonts w:ascii="Wingdings" w:hAnsi="Wingdings" w:hint="default"/>
+        <w:sz w:val="20"/>
+      </w:rPr>
+    </w:lvl>
+    <w:lvl w:ilvl="6" w:tentative="1">
+      <w:start w:val="1"/>
+      <w:numFmt w:val="bullet"/>
+      <w:lvlText w:val=""/>
+      <w:lvlJc w:val="left"/>
+      <w:pPr>
+        <w:tabs>
+          <w:tab w:val="num" w:pos="5040"/>
+        </w:tabs>
+        <w:ind w:left="5040" w:hanging="360"/>
+      </w:pPr>
+      <w:rPr>
+        <w:rFonts w:ascii="Wingdings" w:hAnsi="Wingdings" w:hint="default"/>
+        <w:sz w:val="20"/>
+      </w:rPr>
+    </w:lvl>
+    <w:lvl w:ilvl="7" w:tentative="1">
+      <w:start w:val="1"/>
+      <w:numFmt w:val="bullet"/>
+      <w:lvlText w:val=""/>
+      <w:lvlJc w:val="left"/>
+      <w:pPr>
+        <w:tabs>
+          <w:tab w:val="num" w:pos="5760"/>
+        </w:tabs>
+        <w:ind w:left="5760" w:hanging="360"/>
+      </w:pPr>
+      <w:rPr>
+        <w:rFonts w:ascii="Wingdings" w:hAnsi="Wingdings" w:hint="default"/>
+        <w:sz w:val="20"/>
+      </w:rPr>
+    </w:lvl>
+    <w:lvl w:ilvl="8" w:tentative="1">
+      <w:start w:val="1"/>
+      <w:numFmt w:val="bullet"/>
+      <w:lvlText w:val=""/>
+      <w:lvlJc w:val="left"/>
+      <w:pPr>
+        <w:tabs>
+          <w:tab w:val="num" w:pos="6480"/>
+        </w:tabs>
+        <w:ind w:left="6480" w:hanging="360"/>
+      </w:pPr>
+      <w:rPr>
+        <w:rFonts w:ascii="Wingdings" w:hAnsi="Wingdings" w:hint="default"/>
+        <w:sz w:val="20"/>
+      </w:rPr>
+    </w:lvl>
+  </w:abstractNum>
+  <w:abstractNum w:abstractNumId="3" w15:restartNumberingAfterBreak="0">
+    <w:nsid w:val="3DD54928"/>
+    <w:multiLevelType w:val="hybridMultilevel"/>
+    <w:tmpl w:val="77824218"/>
+    <w:lvl w:ilvl="0" w:tplc="04090001">
+      <w:start w:val="1"/>
+      <w:numFmt w:val="bullet"/>
+      <w:lvlText w:val=""/>
+      <w:lvlJc w:val="left"/>
+      <w:pPr>
+        <w:ind w:left="720" w:hanging="360"/>
+      </w:pPr>
+      <w:rPr>
+        <w:rFonts w:ascii="Symbol" w:hAnsi="Symbol" w:hint="default"/>
+      </w:rPr>
+    </w:lvl>
+    <w:lvl w:ilvl="1" w:tplc="04090003" w:tentative="1">
+      <w:start w:val="1"/>
+      <w:numFmt w:val="bullet"/>
+      <w:lvlText w:val="o"/>
+      <w:lvlJc w:val="left"/>
+      <w:pPr>
+        <w:ind w:left="1440" w:hanging="360"/>
+      </w:pPr>
+      <w:rPr>
+        <w:rFonts w:ascii="Courier New" w:hAnsi="Courier New" w:cs="Courier New" w:hint="default"/>
+      </w:rPr>
+    </w:lvl>
+    <w:lvl w:ilvl="2" w:tplc="04090005" w:tentative="1">
+      <w:start w:val="1"/>
+      <w:numFmt w:val="bullet"/>
+      <w:lvlText w:val=""/>
+      <w:lvlJc w:val="left"/>
+      <w:pPr>
+        <w:ind w:left="2160" w:hanging="360"/>
+      </w:pPr>
+      <w:rPr>
+        <w:rFonts w:ascii="Wingdings" w:hAnsi="Wingdings" w:hint="default"/>
+      </w:rPr>
+    </w:lvl>
+    <w:lvl w:ilvl="3" w:tplc="04090001" w:tentative="1">
+      <w:start w:val="1"/>
+      <w:numFmt w:val="bullet"/>
+      <w:lvlText w:val=""/>
+      <w:lvlJc w:val="left"/>
+      <w:pPr>
+        <w:ind w:left="2880" w:hanging="360"/>
+      </w:pPr>
+      <w:rPr>
+        <w:rFonts w:ascii="Symbol" w:hAnsi="Symbol" w:hint="default"/>
+      </w:rPr>
+    </w:lvl>
+    <w:lvl w:ilvl="4" w:tplc="04090003" w:tentative="1">
+      <w:start w:val="1"/>
+      <w:numFmt w:val="bullet"/>
+      <w:lvlText w:val="o"/>
+      <w:lvlJc w:val="left"/>
+      <w:pPr>
+        <w:ind w:left="3600" w:hanging="360"/>
+      </w:pPr>
+      <w:rPr>
+        <w:rFonts w:ascii="Courier New" w:hAnsi="Courier New" w:cs="Courier New" w:hint="default"/>
+      </w:rPr>
+    </w:lvl>
+    <w:lvl w:ilvl="5" w:tplc="04090005" w:tentative="1">
+      <w:start w:val="1"/>
+      <w:numFmt w:val="bullet"/>
+      <w:lvlText w:val=""/>
+      <w:lvlJc w:val="left"/>
+      <w:pPr>
+        <w:ind w:left="4320" w:hanging="360"/>
+      </w:pPr>
+      <w:rPr>
+        <w:rFonts w:ascii="Wingdings" w:hAnsi="Wingdings" w:hint="default"/>
+      </w:rPr>
+    </w:lvl>
+    <w:lvl w:ilvl="6" w:tplc="04090001" w:tentative="1">
+      <w:start w:val="1"/>
+      <w:numFmt w:val="bullet"/>
+      <w:lvlText w:val=""/>
+      <w:lvlJc w:val="left"/>
+      <w:pPr>
+        <w:ind w:left="5040" w:hanging="360"/>
+      </w:pPr>
+      <w:rPr>
+        <w:rFonts w:ascii="Symbol" w:hAnsi="Symbol" w:hint="default"/>
+      </w:rPr>
+    </w:lvl>
+    <w:lvl w:ilvl="7" w:tplc="04090003" w:tentative="1">
+      <w:start w:val="1"/>
+      <w:numFmt w:val="bullet"/>
+      <w:lvlText w:val="o"/>
+      <w:lvlJc w:val="left"/>
+      <w:pPr>
+        <w:ind w:left="5760" w:hanging="360"/>
+      </w:pPr>
+      <w:rPr>
+        <w:rFonts w:ascii="Courier New" w:hAnsi="Courier New" w:cs="Courier New" w:hint="default"/>
+      </w:rPr>
+    </w:lvl>
+    <w:lvl w:ilvl="8" w:tplc="04090005" w:tentative="1">
+      <w:start w:val="1"/>
+      <w:numFmt w:val="bullet"/>
+      <w:lvlText w:val=""/>
+      <w:lvlJc w:val="left"/>
+      <w:pPr>
+        <w:ind w:left="6480" w:hanging="360"/>
+      </w:pPr>
+      <w:rPr>
+        <w:rFonts w:ascii="Wingdings" w:hAnsi="Wingdings" w:hint="default"/>
+      </w:rPr>
+    </w:lvl>
+  </w:abstractNum>
+  <w:abstractNum w:abstractNumId="4" w15:restartNumberingAfterBreak="0">
+    <w:nsid w:val="3EC8338A"/>
+    <w:multiLevelType w:val="hybridMultilevel"/>
+    <w:tmpl w:val="543843A6"/>
+    <w:lvl w:ilvl="0" w:tplc="EE086AEC">
+      <w:numFmt w:val="bullet"/>
+      <w:lvlText w:val="-"/>
+      <w:lvlJc w:val="left"/>
+      <w:pPr>
+        <w:ind w:left="720" w:hanging="360"/>
+      </w:pPr>
+      <w:rPr>
+        <w:rFonts w:ascii="Calibri" w:eastAsiaTheme="minorHAnsi" w:hAnsi="Calibri" w:cs="Calibri" w:hint="default"/>
+      </w:rPr>
+    </w:lvl>
+    <w:lvl w:ilvl="1" w:tplc="04090003" w:tentative="1">
+      <w:start w:val="1"/>
+      <w:numFmt w:val="bullet"/>
+      <w:lvlText w:val="o"/>
+      <w:lvlJc w:val="left"/>
+      <w:pPr>
+        <w:ind w:left="1440" w:hanging="360"/>
+      </w:pPr>
+      <w:rPr>
+        <w:rFonts w:ascii="Courier New" w:hAnsi="Courier New" w:cs="Courier New" w:hint="default"/>
+      </w:rPr>
+    </w:lvl>
+    <w:lvl w:ilvl="2" w:tplc="04090005" w:tentative="1">
+      <w:start w:val="1"/>
+      <w:numFmt w:val="bullet"/>
+      <w:lvlText w:val=""/>
+      <w:lvlJc w:val="left"/>
+      <w:pPr>
+        <w:ind w:left="2160" w:hanging="360"/>
+      </w:pPr>
+      <w:rPr>
+        <w:rFonts w:ascii="Wingdings" w:hAnsi="Wingdings" w:hint="default"/>
+      </w:rPr>
+    </w:lvl>
+    <w:lvl w:ilvl="3" w:tplc="04090001" w:tentative="1">
+      <w:start w:val="1"/>
+      <w:numFmt w:val="bullet"/>
+      <w:lvlText w:val=""/>
+      <w:lvlJc w:val="left"/>
+      <w:pPr>
+        <w:ind w:left="2880" w:hanging="360"/>
+      </w:pPr>
+      <w:rPr>
+        <w:rFonts w:ascii="Symbol" w:hAnsi="Symbol" w:hint="default"/>
+      </w:rPr>
+    </w:lvl>
+    <w:lvl w:ilvl="4" w:tplc="04090003" w:tentative="1">
+      <w:start w:val="1"/>
+      <w:numFmt w:val="bullet"/>
+      <w:lvlText w:val="o"/>
+      <w:lvlJc w:val="left"/>
+      <w:pPr>
+        <w:ind w:left="3600" w:hanging="360"/>
+      </w:pPr>
+      <w:rPr>
+        <w:rFonts w:ascii="Courier New" w:hAnsi="Courier New" w:cs="Courier New" w:hint="default"/>
+      </w:rPr>
+    </w:lvl>
+    <w:lvl w:ilvl="5" w:tplc="04090005" w:tentative="1">
+      <w:start w:val="1"/>
+      <w:numFmt w:val="bullet"/>
+      <w:lvlText w:val=""/>
+      <w:lvlJc w:val="left"/>
+      <w:pPr>
+        <w:ind w:left="4320" w:hanging="360"/>
+      </w:pPr>
+      <w:rPr>
+        <w:rFonts w:ascii="Wingdings" w:hAnsi="Wingdings" w:hint="default"/>
+      </w:rPr>
+    </w:lvl>
+    <w:lvl w:ilvl="6" w:tplc="04090001" w:tentative="1">
+      <w:start w:val="1"/>
+      <w:numFmt w:val="bullet"/>
+      <w:lvlText w:val=""/>
+      <w:lvlJc w:val="left"/>
+      <w:pPr>
+        <w:ind w:left="5040" w:hanging="360"/>
+      </w:pPr>
+      <w:rPr>
+        <w:rFonts w:ascii="Symbol" w:hAnsi="Symbol" w:hint="default"/>
+      </w:rPr>
+    </w:lvl>
+    <w:lvl w:ilvl="7" w:tplc="04090003" w:tentative="1">
+      <w:start w:val="1"/>
+      <w:numFmt w:val="bullet"/>
+      <w:lvlText w:val="o"/>
+      <w:lvlJc w:val="left"/>
+      <w:pPr>
+        <w:ind w:left="5760" w:hanging="360"/>
+      </w:pPr>
+      <w:rPr>
+        <w:rFonts w:ascii="Courier New" w:hAnsi="Courier New" w:cs="Courier New" w:hint="default"/>
+      </w:rPr>
+    </w:lvl>
+    <w:lvl w:ilvl="8" w:tplc="04090005" w:tentative="1">
+      <w:start w:val="1"/>
+      <w:numFmt w:val="bullet"/>
+      <w:lvlText w:val=""/>
+      <w:lvlJc w:val="left"/>
+      <w:pPr>
+        <w:ind w:left="6480" w:hanging="360"/>
+      </w:pPr>
+      <w:rPr>
+        <w:rFonts w:ascii="Wingdings" w:hAnsi="Wingdings" w:hint="default"/>
+      </w:rPr>
+    </w:lvl>
+  </w:abstractNum>
+  <w:abstractNum w:abstractNumId="5" w15:restartNumberingAfterBreak="0">
+    <w:nsid w:val="4B925C12"/>
+    <w:multiLevelType w:val="hybridMultilevel"/>
+    <w:tmpl w:val="0B424BB4"/>
+    <w:lvl w:ilvl="0" w:tplc="1CAAE5A8">
+      <w:start w:val="5"/>
+      <w:numFmt w:val="bullet"/>
+      <w:lvlText w:val="-"/>
+      <w:lvlJc w:val="left"/>
+      <w:pPr>
+        <w:ind w:left="720" w:hanging="360"/>
+      </w:pPr>
+      <w:rPr>
+        <w:rFonts w:ascii="Calibri" w:eastAsiaTheme="minorHAnsi" w:hAnsi="Calibri" w:cs="Calibri" w:hint="default"/>
+        <w:b/>
+      </w:rPr>
+    </w:lvl>
+    <w:lvl w:ilvl="1" w:tplc="04090003" w:tentative="1">
+      <w:start w:val="1"/>
+      <w:numFmt w:val="bullet"/>
+      <w:lvlText w:val="o"/>
+      <w:lvlJc w:val="left"/>
+      <w:pPr>
+        <w:ind w:left="1440" w:hanging="360"/>
+      </w:pPr>
+      <w:rPr>
+        <w:rFonts w:ascii="Courier New" w:hAnsi="Courier New" w:cs="Courier New" w:hint="default"/>
+      </w:rPr>
+    </w:lvl>
+    <w:lvl w:ilvl="2" w:tplc="04090005" w:tentative="1">
+      <w:start w:val="1"/>
+      <w:numFmt w:val="bullet"/>
+      <w:lvlText w:val=""/>
+      <w:lvlJc w:val="left"/>
+      <w:pPr>
+        <w:ind w:left="2160" w:hanging="360"/>
+      </w:pPr>
+      <w:rPr>
+        <w:rFonts w:ascii="Wingdings" w:hAnsi="Wingdings" w:hint="default"/>
+      </w:rPr>
+    </w:lvl>
+    <w:lvl w:ilvl="3" w:tplc="04090001" w:tentative="1">
+      <w:start w:val="1"/>
+      <w:numFmt w:val="bullet"/>
+      <w:lvlText w:val=""/>
+      <w:lvlJc w:val="left"/>
+      <w:pPr>
+        <w:ind w:left="2880" w:hanging="360"/>
+      </w:pPr>
+      <w:rPr>
+        <w:rFonts w:ascii="Symbol" w:hAnsi="Symbol" w:hint="default"/>
+      </w:rPr>
+    </w:lvl>
+    <w:lvl w:ilvl="4" w:tplc="04090003" w:tentative="1">
+      <w:start w:val="1"/>
+      <w:numFmt w:val="bullet"/>
+      <w:lvlText w:val="o"/>
+      <w:lvlJc w:val="left"/>
+      <w:pPr>
+        <w:ind w:left="3600" w:hanging="360"/>
+      </w:pPr>
+      <w:rPr>
+        <w:rFonts w:ascii="Courier New" w:hAnsi="Courier New" w:cs="Courier New" w:hint="default"/>
+      </w:rPr>
+    </w:lvl>
+    <w:lvl w:ilvl="5" w:tplc="04090005" w:tentative="1">
+      <w:start w:val="1"/>
+      <w:numFmt w:val="bullet"/>
+      <w:lvlText w:val=""/>
+      <w:lvlJc w:val="left"/>
+      <w:pPr>
+        <w:ind w:left="4320" w:hanging="360"/>
+      </w:pPr>
+      <w:rPr>
+        <w:rFonts w:ascii="Wingdings" w:hAnsi="Wingdings" w:hint="default"/>
+      </w:rPr>
+    </w:lvl>
+    <w:lvl w:ilvl="6" w:tplc="04090001" w:tentative="1">
+      <w:start w:val="1"/>
+      <w:numFmt w:val="bullet"/>
+      <w:lvlText w:val=""/>
+      <w:lvlJc w:val="left"/>
+      <w:pPr>
+        <w:ind w:left="5040" w:hanging="360"/>
+      </w:pPr>
+      <w:rPr>
+        <w:rFonts w:ascii="Symbol" w:hAnsi="Symbol" w:hint="default"/>
+      </w:rPr>
+    </w:lvl>
+    <w:lvl w:ilvl="7" w:tplc="04090003" w:tentative="1">
+      <w:start w:val="1"/>
+      <w:numFmt w:val="bullet"/>
+      <w:lvlText w:val="o"/>
+      <w:lvlJc w:val="left"/>
+      <w:pPr>
+        <w:ind w:left="5760" w:hanging="360"/>
+      </w:pPr>
+      <w:rPr>
+        <w:rFonts w:ascii="Courier New" w:hAnsi="Courier New" w:cs="Courier New" w:hint="default"/>
+      </w:rPr>
+    </w:lvl>
+    <w:lvl w:ilvl="8" w:tplc="04090005" w:tentative="1">
+      <w:start w:val="1"/>
+      <w:numFmt w:val="bullet"/>
+      <w:lvlText w:val=""/>
+      <w:lvlJc w:val="left"/>
+      <w:pPr>
+        <w:ind w:left="6480" w:hanging="360"/>
+      </w:pPr>
+      <w:rPr>
+        <w:rFonts w:ascii="Wingdings" w:hAnsi="Wingdings" w:hint="default"/>
+      </w:rPr>
+    </w:lvl>
+  </w:abstractNum>
+  <w:abstractNum w:abstractNumId="6" w15:restartNumberingAfterBreak="0">
+    <w:nsid w:val="75F46716"/>
+    <w:multiLevelType w:val="hybridMultilevel"/>
+    <w:tmpl w:val="8A9CEEE6"/>
+    <w:lvl w:ilvl="0" w:tplc="EE68A488">
+      <w:start w:val="4"/>
+      <w:numFmt w:val="bullet"/>
+      <w:lvlText w:val="-"/>
+      <w:lvlJc w:val="left"/>
+      <w:pPr>
+        <w:ind w:left="720" w:hanging="360"/>
+      </w:pPr>
+      <w:rPr>
+        <w:rFonts w:ascii="Calibri" w:eastAsiaTheme="minorHAnsi" w:hAnsi="Calibri" w:cs="Calibri" w:hint="default"/>
+      </w:rPr>
+    </w:lvl>
+    <w:lvl w:ilvl="1" w:tplc="04090003" w:tentative="1">
+      <w:start w:val="1"/>
+      <w:numFmt w:val="bullet"/>
+      <w:lvlText w:val="o"/>
+      <w:lvlJc w:val="left"/>
+      <w:pPr>
+        <w:ind w:left="1440" w:hanging="360"/>
+      </w:pPr>
+      <w:rPr>
+        <w:rFonts w:ascii="Courier New" w:hAnsi="Courier New" w:cs="Courier New" w:hint="default"/>
+      </w:rPr>
+    </w:lvl>
+    <w:lvl w:ilvl="2" w:tplc="04090005" w:tentative="1">
+      <w:start w:val="1"/>
+      <w:numFmt w:val="bullet"/>
+      <w:lvlText w:val=""/>
+      <w:lvlJc w:val="left"/>
+      <w:pPr>
+        <w:ind w:left="2160" w:hanging="360"/>
+      </w:pPr>
+      <w:rPr>
+        <w:rFonts w:ascii="Wingdings" w:hAnsi="Wingdings" w:hint="default"/>
+      </w:rPr>
+    </w:lvl>
+    <w:lvl w:ilvl="3" w:tplc="04090001" w:tentative="1">
+      <w:start w:val="1"/>
+      <w:numFmt w:val="bullet"/>
+      <w:lvlText w:val=""/>
+      <w:lvlJc w:val="left"/>
+      <w:pPr>
+        <w:ind w:left="2880" w:hanging="360"/>
+      </w:pPr>
+      <w:rPr>
+        <w:rFonts w:ascii="Symbol" w:hAnsi="Symbol" w:hint="default"/>
+      </w:rPr>
+    </w:lvl>
+    <w:lvl w:ilvl="4" w:tplc="04090003" w:tentative="1">
+      <w:start w:val="1"/>
+      <w:numFmt w:val="bullet"/>
+      <w:lvlText w:val="o"/>
+      <w:lvlJc w:val="left"/>
+      <w:pPr>
+        <w:ind w:left="3600" w:hanging="360"/>
+      </w:pPr>
+      <w:rPr>
+        <w:rFonts w:ascii="Courier New" w:hAnsi="Courier New" w:cs="Courier New" w:hint="default"/>
+      </w:rPr>
+    </w:lvl>
+    <w:lvl w:ilvl="5" w:tplc="04090005" w:tentative="1">
+      <w:start w:val="1"/>
+      <w:numFmt w:val="bullet"/>
+      <w:lvlText w:val=""/>
+      <w:lvlJc w:val="left"/>
+      <w:pPr>
+        <w:ind w:left="4320" w:hanging="360"/>
+      </w:pPr>
+      <w:rPr>
+        <w:rFonts w:ascii="Wingdings" w:hAnsi="Wingdings" w:hint="default"/>
+      </w:rPr>
+    </w:lvl>
+    <w:lvl w:ilvl="6" w:tplc="04090001" w:tentative="1">
+      <w:start w:val="1"/>
+      <w:numFmt w:val="bullet"/>
+      <w:lvlText w:val=""/>
+      <w:lvlJc w:val="left"/>
+      <w:pPr>
+        <w:ind w:left="5040" w:hanging="360"/>
+      </w:pPr>
+      <w:rPr>
+        <w:rFonts w:ascii="Symbol" w:hAnsi="Symbol" w:hint="default"/>
+      </w:rPr>
+    </w:lvl>
+    <w:lvl w:ilvl="7" w:tplc="04090003" w:tentative="1">
+      <w:start w:val="1"/>
+      <w:numFmt w:val="bullet"/>
+      <w:lvlText w:val="o"/>
+      <w:lvlJc w:val="left"/>
+      <w:pPr>
+        <w:ind w:left="5760" w:hanging="360"/>
+      </w:pPr>
+      <w:rPr>
+        <w:rFonts w:ascii="Courier New" w:hAnsi="Courier New" w:cs="Courier New" w:hint="default"/>
+      </w:rPr>
+    </w:lvl>
+    <w:lvl w:ilvl="8" w:tplc="04090005" w:tentative="1">
+      <w:start w:val="1"/>
+      <w:numFmt w:val="bullet"/>
+      <w:lvlText w:val=""/>
+      <w:lvlJc w:val="left"/>
+      <w:pPr>
+        <w:ind w:left="6480" w:hanging="360"/>
+      </w:pPr>
+      <w:rPr>
+        <w:rFonts w:ascii="Wingdings" w:hAnsi="Wingdings" w:hint="default"/>
+      </w:rPr>
+    </w:lvl>
+  </w:abstractNum>
+  <w:num w:numId="1">
+    <w:abstractNumId w:val="0"/>
+  </w:num>
+  <w:num w:numId="2">
+    <w:abstractNumId w:val="6"/>
+  </w:num>
+  <w:num w:numId="3">
+    <w:abstractNumId w:val="2"/>
+  </w:num>
+  <w:num w:numId="4">
+    <w:abstractNumId w:val="4"/>
+  </w:num>
+  <w:num w:numId="5">
+    <w:abstractNumId w:val="3"/>
+  </w:num>
+  <w:num w:numId="6">
+    <w:abstractNumId w:val="1"/>
+  </w:num>
+  <w:num w:numId="7">
+    <w:abstractNumId w:val="5"/>
+  </w:num>
+</w:numbering>
 </file>
 
 <file path=word/styles.xml><?xml version="1.0" encoding="utf-8"?>
@@ -2297,7 +5915,6 @@
     <w:name w:val="Normal (Web)"/>
     <w:basedOn w:val="Normal"/>
     <w:uiPriority w:val="99"/>
-    <w:semiHidden/>
     <w:unhideWhenUsed/>
     <w:rsid w:val="004051EB"/>
     <w:pPr>
@@ -2308,6 +5925,17 @@
       <w:sz w:val="24"/>
       <w:szCs w:val="24"/>
     </w:rPr>
+  </w:style>
+  <w:style w:type="paragraph" w:styleId="Prrafodelista">
+    <w:name w:val="List Paragraph"/>
+    <w:basedOn w:val="Normal"/>
+    <w:uiPriority w:val="34"/>
+    <w:qFormat/>
+    <w:rsid w:val="00746E9D"/>
+    <w:pPr>
+      <w:ind w:left="720"/>
+      <w:contextualSpacing/>
+    </w:pPr>
   </w:style>
 </w:styles>
 </file>

</xml_diff>